<commit_message>
5e T1 : corrigé 002_C « De l'énergie ou des énergies ? » en Belle Allure (Word et PDF)
Co-Authored-By: Claude Opus 5.5 <noreply@anthropic.com>
Claude-Session: https://claude.ai/code/session_01MXbzGDRQSvh31KmCSLURJ6
</commit_message>
<xml_diff>
--- a/docs/local/DOCX/5eT1/002_C.docx
+++ b/docs/local/DOCX/5eT1/002_C.docx
@@ -21,6 +21,7 @@
         <w:tc>
           <w:tcPr>
             <w:tcW w:w="3397" w:type="dxa"/>
+            <w:vAlign w:val="center"/>
           </w:tcPr>
           <w:p>
             <w:pPr>
@@ -36,17 +37,9 @@
                 <w:color w:val="000000" w:themeColor="text1"/>
               </w:rPr>
               <w:drawing>
-                <wp:anchor distT="0" distB="0" distL="114300" distR="114300" simplePos="0" relativeHeight="251669504" behindDoc="0" locked="0" layoutInCell="1" allowOverlap="1" wp14:anchorId="334AD4FE" wp14:editId="58D9D23D">
-                  <wp:simplePos x="0" y="0"/>
-                  <wp:positionH relativeFrom="column">
-                    <wp:posOffset>207645</wp:posOffset>
-                  </wp:positionH>
-                  <wp:positionV relativeFrom="margin">
-                    <wp:posOffset>63293</wp:posOffset>
-                  </wp:positionV>
+                <wp:inline distT="0" distB="0" distL="0" distR="0">
                   <wp:extent cx="1606550" cy="842645"/>
                   <wp:effectExtent l="0" t="0" r="6350" b="0"/>
-                  <wp:wrapSquare wrapText="bothSides"/>
                   <wp:docPr id="905082273" name="Image 1"/>
                   <wp:cNvGraphicFramePr>
                     <a:graphicFrameLocks xmlns:a="http://schemas.openxmlformats.org/drawingml/2006/main" noChangeAspect="1"/>
@@ -89,24 +82,30 @@
                       </pic:pic>
                     </a:graphicData>
                   </a:graphic>
-                  <wp14:sizeRelH relativeFrom="margin">
-                    <wp14:pctWidth>0</wp14:pctWidth>
-                  </wp14:sizeRelH>
-                  <wp14:sizeRelV relativeFrom="margin">
-                    <wp14:pctHeight>0</wp14:pctHeight>
-                  </wp14:sizeRelV>
-                </wp:anchor>
+                </wp:inline>
               </w:drawing>
             </w:r>
-            <w:r>
+          </w:p>
+          <w:p>
+            <w:pPr>
+              <w:jc w:val="center"/>
               <w:rPr>
                 <w:rFonts w:ascii="Aptos" w:hAnsi="Aptos"/>
               </w:rPr>
+            </w:pPr>
+            <w:r>
+              <w:rPr>
+                <w:rFonts w:ascii="Aptos" w:hAnsi="Aptos"/>
+                <w:sz w:val="20"/>
+                <w:szCs w:val="20"/>
+              </w:rPr>
               <w:t>1</w:t>
             </w:r>
             <w:r>
               <w:rPr>
                 <w:rFonts w:ascii="Aptos" w:hAnsi="Aptos"/>
+                <w:sz w:val="20"/>
+                <w:szCs w:val="20"/>
                 <w:vertAlign w:val="superscript"/>
               </w:rPr>
               <w:t>er</w:t>
@@ -114,12 +113,16 @@
             <w:r>
               <w:rPr>
                 <w:rFonts w:ascii="Aptos" w:hAnsi="Aptos"/>
+                <w:sz w:val="20"/>
+                <w:szCs w:val="20"/>
               </w:rPr>
               <w:t xml:space="preserve"> Trimestre | 2026 – 2027 | 5</w:t>
             </w:r>
             <w:r>
               <w:rPr>
                 <w:rFonts w:ascii="Aptos" w:hAnsi="Aptos"/>
+                <w:sz w:val="20"/>
+                <w:szCs w:val="20"/>
                 <w:vertAlign w:val="superscript"/>
               </w:rPr>
               <w:t>e</w:t>
@@ -2382,6 +2385,57 @@
               <w:t xml:space="preserve"> </w:t>
             </w:r>
           </w:p>
+          <w:p>
+            <w:pPr>
+              <w:pStyle w:val="Paragraphedeliste"/>
+              <w:suppressAutoHyphens/>
+              <w:spacing w:before="60" w:after="60"/>
+              <w:ind w:left="28"/>
+              <w:contextualSpacing w:val="0"/>
+              <w:jc w:val="both"/>
+            </w:pPr>
+            <w:r>
+              <w:rPr>
+                <w:rFonts w:asciiTheme="minorHAnsi" w:hAnsiTheme="minorHAnsi" w:cstheme="minorHAnsi"/>
+                <w:bCs/>
+              </w:rPr>
+              <w:t xml:space="preserve">L’énergie cinétique et l’énergie de pesanteur sont aussi appelées </w:t>
+            </w:r>
+            <w:r>
+              <w:rPr>
+                <w:rFonts w:asciiTheme="minorHAnsi" w:hAnsiTheme="minorHAnsi" w:cstheme="minorHAnsi"/>
+                <w:b/>
+                <w:i/>
+                <w:iCs/>
+                <w:color w:val="0070C0"/>
+              </w:rPr>
+              <w:t xml:space="preserve">énergie mécanique</w:t>
+            </w:r>
+            <w:r>
+              <w:rPr>
+                <w:rFonts w:asciiTheme="minorHAnsi" w:hAnsiTheme="minorHAnsi" w:cstheme="minorHAnsi"/>
+                <w:bCs/>
+              </w:rPr>
+              <w:t xml:space="preserve">. L’énergie lumineuse est aussi appelée </w:t>
+            </w:r>
+            <w:r>
+              <w:rPr>
+                <w:rFonts w:asciiTheme="minorHAnsi" w:hAnsiTheme="minorHAnsi" w:cstheme="minorHAnsi"/>
+                <w:b/>
+                <w:i/>
+                <w:iCs/>
+                <w:color w:val="0070C0"/>
+              </w:rPr>
+              <w:t xml:space="preserve">énergie rayonnante</w:t>
+            </w:r>
+            <w:r>
+              <w:rPr>
+                <w:rFonts w:asciiTheme="minorHAnsi" w:hAnsiTheme="minorHAnsi" w:cstheme="minorHAnsi"/>
+                <w:bCs/>
+              </w:rPr>
+              <w:t xml:space="preserve">.</w:t>
+            </w:r>
+          </w:p>
         </w:tc>
       </w:tr>
     </w:tbl>
@@ -2799,6 +2853,1918 @@
     </w:p>
     <w:p>
       <w:pPr>
+        <w:spacing w:before="120" w:after="60"/>
+      </w:pPr>
+      <w:r>
+        <w:rPr>
+          <w:rFonts w:ascii="Aptos" w:hAnsi="Aptos"/>
+          <w:i/>
+          <w:sz w:val="20"/>
+          <w:szCs w:val="20"/>
+        </w:rPr>
+        <w:t xml:space="preserve">Réponses aux questions 1 à 5 :</w:t>
+      </w:r>
+    </w:p>
+    <w:tbl>
+      <w:tblPr>
+        <w:tblW w:w="10800" w:type="dxa"/>
+        <w:jc w:val="center"/>
+        <w:tblBorders>
+          <w:top w:val="single" w:sz="4" w:space="0" w:color="7F7F7F"/>
+          <w:left w:val="single" w:sz="4" w:space="0" w:color="7F7F7F"/>
+          <w:bottom w:val="single" w:sz="4" w:space="0" w:color="7F7F7F"/>
+          <w:right w:val="single" w:sz="4" w:space="0" w:color="7F7F7F"/>
+          <w:insideH w:val="single" w:sz="4" w:space="0" w:color="7F7F7F"/>
+          <w:insideV w:val="single" w:sz="4" w:space="0" w:color="7F7F7F"/>
+        </w:tblBorders>
+        <w:tblLayout w:type="fixed"/>
+        <w:tblCellMar>
+          <w:left w:w="60" w:type="dxa"/>
+          <w:right w:w="60" w:type="dxa"/>
+        </w:tblCellMar>
+      </w:tblPr>
+      <w:tblGrid>
+        <w:gridCol w:w="2050"/>
+        <w:gridCol w:w="2000"/>
+        <w:gridCol w:w="1350"/>
+        <w:gridCol w:w="2050"/>
+        <w:gridCol w:w="3350"/>
+      </w:tblGrid>
+      <w:tr>
+        <w:trPr>
+          <w:tblHeader/>
+          <w:cantSplit/>
+        </w:trPr>
+        <w:tc>
+          <w:tcPr>
+            <w:tcW w:w="2050" w:type="dxa"/>
+            <w:shd w:val="clear" w:color="auto" w:fill="FBE4D5"/>
+            <w:vAlign w:val="center"/>
+          </w:tcPr>
+          <w:p>
+            <w:pPr>
+              <w:spacing w:before="20" w:after="20" w:line="240" w:lineRule="auto"/>
+              <w:jc w:val="center"/>
+            </w:pPr>
+            <w:r>
+              <w:rPr>
+                <w:rFonts w:ascii="Aptos" w:hAnsi="Aptos"/>
+                <w:sz w:val="18"/>
+                <w:szCs w:val="18"/>
+              </w:rPr>
+              <w:t xml:space="preserve">Image</w:t>
+            </w:r>
+          </w:p>
+        </w:tc>
+        <w:tc>
+          <w:tcPr>
+            <w:tcW w:w="2000" w:type="dxa"/>
+            <w:shd w:val="clear" w:color="auto" w:fill="FBE4D5"/>
+            <w:vAlign w:val="center"/>
+          </w:tcPr>
+          <w:p>
+            <w:pPr>
+              <w:spacing w:before="20" w:after="20" w:line="240" w:lineRule="auto"/>
+              <w:jc w:val="center"/>
+            </w:pPr>
+            <w:r>
+              <w:rPr>
+                <w:rFonts w:ascii="Aptos" w:hAnsi="Aptos"/>
+                <w:sz w:val="18"/>
+                <w:szCs w:val="18"/>
+              </w:rPr>
+              <w:t xml:space="preserve">Ressource en énergie</w:t>
+            </w:r>
+          </w:p>
+        </w:tc>
+        <w:tc>
+          <w:tcPr>
+            <w:tcW w:w="1350" w:type="dxa"/>
+            <w:shd w:val="clear" w:color="auto" w:fill="FBE4D5"/>
+            <w:vAlign w:val="center"/>
+          </w:tcPr>
+          <w:p>
+            <w:pPr>
+              <w:spacing w:before="20" w:after="20" w:line="240" w:lineRule="auto"/>
+              <w:jc w:val="center"/>
+            </w:pPr>
+            <w:r>
+              <w:rPr>
+                <w:rFonts w:ascii="Aptos" w:hAnsi="Aptos"/>
+                <w:sz w:val="18"/>
+                <w:szCs w:val="18"/>
+              </w:rPr>
+              <w:t xml:space="preserve">Renouvelable ?</w:t>
+            </w:r>
+          </w:p>
+        </w:tc>
+        <w:tc>
+          <w:tcPr>
+            <w:tcW w:w="2050" w:type="dxa"/>
+            <w:shd w:val="clear" w:color="auto" w:fill="FBE4D5"/>
+            <w:vAlign w:val="center"/>
+          </w:tcPr>
+          <w:p>
+            <w:pPr>
+              <w:spacing w:before="20" w:after="20" w:line="240" w:lineRule="auto"/>
+              <w:jc w:val="center"/>
+            </w:pPr>
+            <w:r>
+              <w:rPr>
+                <w:rFonts w:ascii="Aptos" w:hAnsi="Aptos"/>
+                <w:sz w:val="18"/>
+                <w:szCs w:val="18"/>
+              </w:rPr>
+              <w:t xml:space="preserve">Forme(s) d’énergie</w:t>
+            </w:r>
+          </w:p>
+        </w:tc>
+        <w:tc>
+          <w:tcPr>
+            <w:tcW w:w="3350" w:type="dxa"/>
+            <w:shd w:val="clear" w:color="auto" w:fill="FBE4D5"/>
+            <w:vAlign w:val="center"/>
+          </w:tcPr>
+          <w:p>
+            <w:pPr>
+              <w:spacing w:before="20" w:after="20" w:line="240" w:lineRule="auto"/>
+              <w:jc w:val="center"/>
+            </w:pPr>
+            <w:r>
+              <w:rPr>
+                <w:rFonts w:ascii="Aptos" w:hAnsi="Aptos"/>
+                <w:sz w:val="18"/>
+                <w:szCs w:val="18"/>
+              </w:rPr>
+              <w:t xml:space="preserve">Conversion d’énergie ?</w:t>
+            </w:r>
+          </w:p>
+        </w:tc>
+      </w:tr>
+      <w:tr>
+        <w:trPr>
+          <w:cantSplit/>
+        </w:trPr>
+        <w:tc>
+          <w:tcPr>
+            <w:tcW w:w="2050" w:type="dxa"/>
+            <w:vAlign w:val="center"/>
+          </w:tcPr>
+          <w:p>
+            <w:pPr>
+              <w:spacing w:before="20" w:after="20" w:line="240" w:lineRule="auto"/>
+              <w:jc w:val="center"/>
+            </w:pPr>
+            <w:r>
+              <w:rPr>
+                <w:rFonts w:ascii="Aptos" w:hAnsi="Aptos"/>
+                <w:sz w:val="18"/>
+                <w:szCs w:val="18"/>
+              </w:rPr>
+              <w:t xml:space="preserve">Un champ d’éoliennes</w:t>
+            </w:r>
+          </w:p>
+        </w:tc>
+        <w:tc>
+          <w:tcPr>
+            <w:tcW w:w="2000" w:type="dxa"/>
+            <w:vAlign w:val="center"/>
+          </w:tcPr>
+          <w:p>
+            <w:pPr>
+              <w:spacing w:before="20" w:after="20" w:line="240" w:lineRule="auto"/>
+              <w:jc w:val="center"/>
+            </w:pPr>
+            <w:r>
+              <w:rPr>
+                <w:rFonts w:ascii="Belle Allure CE" w:hAnsi="Belle Allure CE" w:cs="Belle Allure CE"/>
+                <w:b/>
+                <w:bCs/>
+                <w:color w:val="0A1F66"/>
+                <w:sz w:val="18"/>
+                <w:szCs w:val="18"/>
+              </w:rPr>
+              <w:t xml:space="preserve">le vent</w:t>
+            </w:r>
+          </w:p>
+        </w:tc>
+        <w:tc>
+          <w:tcPr>
+            <w:tcW w:w="1350" w:type="dxa"/>
+            <w:vAlign w:val="center"/>
+          </w:tcPr>
+          <w:p>
+            <w:pPr>
+              <w:spacing w:before="20" w:after="20" w:line="240" w:lineRule="auto"/>
+              <w:jc w:val="center"/>
+            </w:pPr>
+            <w:r>
+              <w:rPr>
+                <w:rFonts w:ascii="Belle Allure CE" w:hAnsi="Belle Allure CE" w:cs="Belle Allure CE"/>
+                <w:b/>
+                <w:bCs/>
+                <w:color w:val="0A1F66"/>
+                <w:sz w:val="18"/>
+                <w:szCs w:val="18"/>
+              </w:rPr>
+              <w:t xml:space="preserve">oui</w:t>
+            </w:r>
+          </w:p>
+        </w:tc>
+        <w:tc>
+          <w:tcPr>
+            <w:tcW w:w="2050" w:type="dxa"/>
+            <w:vAlign w:val="center"/>
+          </w:tcPr>
+          <w:p>
+            <w:pPr>
+              <w:spacing w:before="20" w:after="20" w:line="240" w:lineRule="auto"/>
+              <w:jc w:val="center"/>
+            </w:pPr>
+            <w:r>
+              <w:rPr>
+                <w:rFonts w:ascii="Belle Allure CE" w:hAnsi="Belle Allure CE" w:cs="Belle Allure CE"/>
+                <w:b/>
+                <w:bCs/>
+                <w:color w:val="0A1F66"/>
+                <w:sz w:val="18"/>
+                <w:szCs w:val="18"/>
+              </w:rPr>
+              <w:t xml:space="preserve">énergie cinétique (mécanique)</w:t>
+            </w:r>
+          </w:p>
+        </w:tc>
+        <w:tc>
+          <w:tcPr>
+            <w:tcW w:w="3350" w:type="dxa"/>
+            <w:vAlign w:val="center"/>
+          </w:tcPr>
+          <w:p>
+            <w:pPr>
+              <w:spacing w:before="20" w:after="20" w:line="240" w:lineRule="auto"/>
+              <w:jc w:val="center"/>
+            </w:pPr>
+            <w:r>
+              <w:rPr>
+                <w:rFonts w:ascii="Belle Allure CE" w:hAnsi="Belle Allure CE" w:cs="Belle Allure CE"/>
+                <w:b/>
+                <w:bCs/>
+                <w:color w:val="0A1F66"/>
+                <w:sz w:val="18"/>
+                <w:szCs w:val="18"/>
+              </w:rPr>
+              <w:t xml:space="preserve">oui : l’éolienne convertit l’énergie cinétique du vent en énergie électrique</w:t>
+            </w:r>
+          </w:p>
+        </w:tc>
+      </w:tr>
+      <w:tr>
+        <w:trPr>
+          <w:cantSplit/>
+        </w:trPr>
+        <w:tc>
+          <w:tcPr>
+            <w:tcW w:w="2050" w:type="dxa"/>
+            <w:vAlign w:val="center"/>
+          </w:tcPr>
+          <w:p>
+            <w:pPr>
+              <w:spacing w:before="20" w:after="20" w:line="240" w:lineRule="auto"/>
+              <w:jc w:val="center"/>
+            </w:pPr>
+            <w:r>
+              <w:rPr>
+                <w:rFonts w:ascii="Aptos" w:hAnsi="Aptos"/>
+                <w:sz w:val="18"/>
+                <w:szCs w:val="18"/>
+              </w:rPr>
+              <w:t xml:space="preserve">Le Soleil</w:t>
+            </w:r>
+          </w:p>
+        </w:tc>
+        <w:tc>
+          <w:tcPr>
+            <w:tcW w:w="2000" w:type="dxa"/>
+            <w:vAlign w:val="center"/>
+          </w:tcPr>
+          <w:p>
+            <w:pPr>
+              <w:spacing w:before="20" w:after="20" w:line="240" w:lineRule="auto"/>
+              <w:jc w:val="center"/>
+            </w:pPr>
+            <w:r>
+              <w:rPr>
+                <w:rFonts w:ascii="Belle Allure CE" w:hAnsi="Belle Allure CE" w:cs="Belle Allure CE"/>
+                <w:b/>
+                <w:bCs/>
+                <w:color w:val="0A1F66"/>
+                <w:sz w:val="18"/>
+                <w:szCs w:val="18"/>
+              </w:rPr>
+              <w:t xml:space="preserve">le Soleil</w:t>
+            </w:r>
+          </w:p>
+        </w:tc>
+        <w:tc>
+          <w:tcPr>
+            <w:tcW w:w="1350" w:type="dxa"/>
+            <w:vAlign w:val="center"/>
+          </w:tcPr>
+          <w:p>
+            <w:pPr>
+              <w:spacing w:before="20" w:after="20" w:line="240" w:lineRule="auto"/>
+              <w:jc w:val="center"/>
+            </w:pPr>
+            <w:r>
+              <w:rPr>
+                <w:rFonts w:ascii="Belle Allure CE" w:hAnsi="Belle Allure CE" w:cs="Belle Allure CE"/>
+                <w:b/>
+                <w:bCs/>
+                <w:color w:val="0A1F66"/>
+                <w:sz w:val="18"/>
+                <w:szCs w:val="18"/>
+              </w:rPr>
+              <w:t xml:space="preserve">oui</w:t>
+            </w:r>
+          </w:p>
+        </w:tc>
+        <w:tc>
+          <w:tcPr>
+            <w:tcW w:w="2050" w:type="dxa"/>
+            <w:vAlign w:val="center"/>
+          </w:tcPr>
+          <w:p>
+            <w:pPr>
+              <w:spacing w:before="20" w:after="20" w:line="240" w:lineRule="auto"/>
+              <w:jc w:val="center"/>
+            </w:pPr>
+            <w:r>
+              <w:rPr>
+                <w:rFonts w:ascii="Belle Allure CE" w:hAnsi="Belle Allure CE" w:cs="Belle Allure CE"/>
+                <w:b/>
+                <w:bCs/>
+                <w:color w:val="0A1F66"/>
+                <w:sz w:val="18"/>
+                <w:szCs w:val="18"/>
+              </w:rPr>
+              <w:t xml:space="preserve">énergie lumineuse (rayonnante) et énergie thermique</w:t>
+            </w:r>
+          </w:p>
+        </w:tc>
+        <w:tc>
+          <w:tcPr>
+            <w:tcW w:w="3350" w:type="dxa"/>
+            <w:vAlign w:val="center"/>
+          </w:tcPr>
+          <w:p>
+            <w:pPr>
+              <w:spacing w:before="20" w:after="20" w:line="240" w:lineRule="auto"/>
+              <w:jc w:val="center"/>
+            </w:pPr>
+            <w:r>
+              <w:rPr>
+                <w:rFonts w:ascii="Belle Allure CE" w:hAnsi="Belle Allure CE" w:cs="Belle Allure CE"/>
+                <w:b/>
+                <w:bCs/>
+                <w:color w:val="0A1F66"/>
+                <w:sz w:val="18"/>
+                <w:szCs w:val="18"/>
+              </w:rPr>
+              <w:t xml:space="preserve">non</w:t>
+            </w:r>
+          </w:p>
+        </w:tc>
+      </w:tr>
+      <w:tr>
+        <w:trPr>
+          <w:cantSplit/>
+        </w:trPr>
+        <w:tc>
+          <w:tcPr>
+            <w:tcW w:w="2050" w:type="dxa"/>
+            <w:vAlign w:val="center"/>
+          </w:tcPr>
+          <w:p>
+            <w:pPr>
+              <w:spacing w:before="20" w:after="20" w:line="240" w:lineRule="auto"/>
+              <w:jc w:val="center"/>
+            </w:pPr>
+            <w:r>
+              <w:rPr>
+                <w:rFonts w:ascii="Aptos" w:hAnsi="Aptos"/>
+                <w:sz w:val="18"/>
+                <w:szCs w:val="18"/>
+              </w:rPr>
+              <w:t xml:space="preserve">Un barrage hydroélectrique</w:t>
+            </w:r>
+          </w:p>
+        </w:tc>
+        <w:tc>
+          <w:tcPr>
+            <w:tcW w:w="2000" w:type="dxa"/>
+            <w:vAlign w:val="center"/>
+          </w:tcPr>
+          <w:p>
+            <w:pPr>
+              <w:spacing w:before="20" w:after="20" w:line="240" w:lineRule="auto"/>
+              <w:jc w:val="center"/>
+            </w:pPr>
+            <w:r>
+              <w:rPr>
+                <w:rFonts w:ascii="Belle Allure CE" w:hAnsi="Belle Allure CE" w:cs="Belle Allure CE"/>
+                <w:b/>
+                <w:bCs/>
+                <w:color w:val="0A1F66"/>
+                <w:sz w:val="18"/>
+                <w:szCs w:val="18"/>
+              </w:rPr>
+              <w:t xml:space="preserve">l’eau retenue par le barrage</w:t>
+            </w:r>
+          </w:p>
+        </w:tc>
+        <w:tc>
+          <w:tcPr>
+            <w:tcW w:w="1350" w:type="dxa"/>
+            <w:vAlign w:val="center"/>
+          </w:tcPr>
+          <w:p>
+            <w:pPr>
+              <w:spacing w:before="20" w:after="20" w:line="240" w:lineRule="auto"/>
+              <w:jc w:val="center"/>
+            </w:pPr>
+            <w:r>
+              <w:rPr>
+                <w:rFonts w:ascii="Belle Allure CE" w:hAnsi="Belle Allure CE" w:cs="Belle Allure CE"/>
+                <w:b/>
+                <w:bCs/>
+                <w:color w:val="0A1F66"/>
+                <w:sz w:val="18"/>
+                <w:szCs w:val="18"/>
+              </w:rPr>
+              <w:t xml:space="preserve">oui</w:t>
+            </w:r>
+          </w:p>
+        </w:tc>
+        <w:tc>
+          <w:tcPr>
+            <w:tcW w:w="2050" w:type="dxa"/>
+            <w:vAlign w:val="center"/>
+          </w:tcPr>
+          <w:p>
+            <w:pPr>
+              <w:spacing w:before="20" w:after="20" w:line="240" w:lineRule="auto"/>
+              <w:jc w:val="center"/>
+            </w:pPr>
+            <w:r>
+              <w:rPr>
+                <w:rFonts w:ascii="Belle Allure CE" w:hAnsi="Belle Allure CE" w:cs="Belle Allure CE"/>
+                <w:b/>
+                <w:bCs/>
+                <w:color w:val="0A1F66"/>
+                <w:sz w:val="18"/>
+                <w:szCs w:val="18"/>
+              </w:rPr>
+              <w:t xml:space="preserve">énergie de pesanteur puis énergie cinétique (mécanique)</w:t>
+            </w:r>
+          </w:p>
+        </w:tc>
+        <w:tc>
+          <w:tcPr>
+            <w:tcW w:w="3350" w:type="dxa"/>
+            <w:vAlign w:val="center"/>
+          </w:tcPr>
+          <w:p>
+            <w:pPr>
+              <w:spacing w:before="20" w:after="20" w:line="240" w:lineRule="auto"/>
+              <w:jc w:val="center"/>
+            </w:pPr>
+            <w:r>
+              <w:rPr>
+                <w:rFonts w:ascii="Belle Allure CE" w:hAnsi="Belle Allure CE" w:cs="Belle Allure CE"/>
+                <w:b/>
+                <w:bCs/>
+                <w:color w:val="0A1F66"/>
+                <w:sz w:val="18"/>
+                <w:szCs w:val="18"/>
+              </w:rPr>
+              <w:t xml:space="preserve">oui : il convertit l’énergie de l’eau en énergie électrique</w:t>
+            </w:r>
+          </w:p>
+        </w:tc>
+      </w:tr>
+      <w:tr>
+        <w:trPr>
+          <w:cantSplit/>
+        </w:trPr>
+        <w:tc>
+          <w:tcPr>
+            <w:tcW w:w="2050" w:type="dxa"/>
+            <w:vAlign w:val="center"/>
+          </w:tcPr>
+          <w:p>
+            <w:pPr>
+              <w:spacing w:before="20" w:after="20" w:line="240" w:lineRule="auto"/>
+              <w:jc w:val="center"/>
+            </w:pPr>
+            <w:r>
+              <w:rPr>
+                <w:rFonts w:ascii="Aptos" w:hAnsi="Aptos"/>
+                <w:sz w:val="18"/>
+                <w:szCs w:val="18"/>
+              </w:rPr>
+              <w:t xml:space="preserve">Une forêt</w:t>
+            </w:r>
+          </w:p>
+        </w:tc>
+        <w:tc>
+          <w:tcPr>
+            <w:tcW w:w="2000" w:type="dxa"/>
+            <w:vAlign w:val="center"/>
+          </w:tcPr>
+          <w:p>
+            <w:pPr>
+              <w:spacing w:before="20" w:after="20" w:line="240" w:lineRule="auto"/>
+              <w:jc w:val="center"/>
+            </w:pPr>
+            <w:r>
+              <w:rPr>
+                <w:rFonts w:ascii="Belle Allure CE" w:hAnsi="Belle Allure CE" w:cs="Belle Allure CE"/>
+                <w:b/>
+                <w:bCs/>
+                <w:color w:val="0A1F66"/>
+                <w:sz w:val="18"/>
+                <w:szCs w:val="18"/>
+              </w:rPr>
+              <w:t xml:space="preserve">le bois</w:t>
+            </w:r>
+          </w:p>
+        </w:tc>
+        <w:tc>
+          <w:tcPr>
+            <w:tcW w:w="1350" w:type="dxa"/>
+            <w:vAlign w:val="center"/>
+          </w:tcPr>
+          <w:p>
+            <w:pPr>
+              <w:spacing w:before="20" w:after="20" w:line="240" w:lineRule="auto"/>
+              <w:jc w:val="center"/>
+            </w:pPr>
+            <w:r>
+              <w:rPr>
+                <w:rFonts w:ascii="Belle Allure CE" w:hAnsi="Belle Allure CE" w:cs="Belle Allure CE"/>
+                <w:b/>
+                <w:bCs/>
+                <w:color w:val="0A1F66"/>
+                <w:sz w:val="18"/>
+                <w:szCs w:val="18"/>
+              </w:rPr>
+              <w:t xml:space="preserve">oui</w:t>
+            </w:r>
+          </w:p>
+        </w:tc>
+        <w:tc>
+          <w:tcPr>
+            <w:tcW w:w="2050" w:type="dxa"/>
+            <w:vAlign w:val="center"/>
+          </w:tcPr>
+          <w:p>
+            <w:pPr>
+              <w:spacing w:before="20" w:after="20" w:line="240" w:lineRule="auto"/>
+              <w:jc w:val="center"/>
+            </w:pPr>
+            <w:r>
+              <w:rPr>
+                <w:rFonts w:ascii="Belle Allure CE" w:hAnsi="Belle Allure CE" w:cs="Belle Allure CE"/>
+                <w:b/>
+                <w:bCs/>
+                <w:color w:val="0A1F66"/>
+                <w:sz w:val="18"/>
+                <w:szCs w:val="18"/>
+              </w:rPr>
+              <w:t xml:space="preserve">énergie chimique</w:t>
+            </w:r>
+          </w:p>
+        </w:tc>
+        <w:tc>
+          <w:tcPr>
+            <w:tcW w:w="3350" w:type="dxa"/>
+            <w:vAlign w:val="center"/>
+          </w:tcPr>
+          <w:p>
+            <w:pPr>
+              <w:spacing w:before="20" w:after="20" w:line="240" w:lineRule="auto"/>
+              <w:jc w:val="center"/>
+            </w:pPr>
+            <w:r>
+              <w:rPr>
+                <w:rFonts w:ascii="Belle Allure CE" w:hAnsi="Belle Allure CE" w:cs="Belle Allure CE"/>
+                <w:b/>
+                <w:bCs/>
+                <w:color w:val="0A1F66"/>
+                <w:sz w:val="18"/>
+                <w:szCs w:val="18"/>
+              </w:rPr>
+              <w:t xml:space="preserve">non</w:t>
+            </w:r>
+          </w:p>
+        </w:tc>
+      </w:tr>
+      <w:tr>
+        <w:trPr>
+          <w:cantSplit/>
+        </w:trPr>
+        <w:tc>
+          <w:tcPr>
+            <w:tcW w:w="2050" w:type="dxa"/>
+            <w:vAlign w:val="center"/>
+          </w:tcPr>
+          <w:p>
+            <w:pPr>
+              <w:spacing w:before="20" w:after="20" w:line="240" w:lineRule="auto"/>
+              <w:jc w:val="center"/>
+            </w:pPr>
+            <w:r>
+              <w:rPr>
+                <w:rFonts w:ascii="Aptos" w:hAnsi="Aptos"/>
+                <w:sz w:val="18"/>
+                <w:szCs w:val="18"/>
+              </w:rPr>
+              <w:t xml:space="preserve">Un puits de pétrole</w:t>
+            </w:r>
+          </w:p>
+        </w:tc>
+        <w:tc>
+          <w:tcPr>
+            <w:tcW w:w="2000" w:type="dxa"/>
+            <w:vAlign w:val="center"/>
+          </w:tcPr>
+          <w:p>
+            <w:pPr>
+              <w:spacing w:before="20" w:after="20" w:line="240" w:lineRule="auto"/>
+              <w:jc w:val="center"/>
+            </w:pPr>
+            <w:r>
+              <w:rPr>
+                <w:rFonts w:ascii="Belle Allure CE" w:hAnsi="Belle Allure CE" w:cs="Belle Allure CE"/>
+                <w:b/>
+                <w:bCs/>
+                <w:color w:val="0A1F66"/>
+                <w:sz w:val="18"/>
+                <w:szCs w:val="18"/>
+              </w:rPr>
+              <w:t xml:space="preserve">le pétrole</w:t>
+            </w:r>
+          </w:p>
+        </w:tc>
+        <w:tc>
+          <w:tcPr>
+            <w:tcW w:w="1350" w:type="dxa"/>
+            <w:vAlign w:val="center"/>
+          </w:tcPr>
+          <w:p>
+            <w:pPr>
+              <w:spacing w:before="20" w:after="20" w:line="240" w:lineRule="auto"/>
+              <w:jc w:val="center"/>
+            </w:pPr>
+            <w:r>
+              <w:rPr>
+                <w:rFonts w:ascii="Belle Allure CE" w:hAnsi="Belle Allure CE" w:cs="Belle Allure CE"/>
+                <w:b/>
+                <w:bCs/>
+                <w:color w:val="0A1F66"/>
+                <w:sz w:val="18"/>
+                <w:szCs w:val="18"/>
+              </w:rPr>
+              <w:t xml:space="preserve">non</w:t>
+            </w:r>
+          </w:p>
+        </w:tc>
+        <w:tc>
+          <w:tcPr>
+            <w:tcW w:w="2050" w:type="dxa"/>
+            <w:vAlign w:val="center"/>
+          </w:tcPr>
+          <w:p>
+            <w:pPr>
+              <w:spacing w:before="20" w:after="20" w:line="240" w:lineRule="auto"/>
+              <w:jc w:val="center"/>
+            </w:pPr>
+            <w:r>
+              <w:rPr>
+                <w:rFonts w:ascii="Belle Allure CE" w:hAnsi="Belle Allure CE" w:cs="Belle Allure CE"/>
+                <w:b/>
+                <w:bCs/>
+                <w:color w:val="0A1F66"/>
+                <w:sz w:val="18"/>
+                <w:szCs w:val="18"/>
+              </w:rPr>
+              <w:t xml:space="preserve">énergie chimique</w:t>
+            </w:r>
+          </w:p>
+        </w:tc>
+        <w:tc>
+          <w:tcPr>
+            <w:tcW w:w="3350" w:type="dxa"/>
+            <w:vAlign w:val="center"/>
+          </w:tcPr>
+          <w:p>
+            <w:pPr>
+              <w:spacing w:before="20" w:after="20" w:line="240" w:lineRule="auto"/>
+              <w:jc w:val="center"/>
+            </w:pPr>
+            <w:r>
+              <w:rPr>
+                <w:rFonts w:ascii="Belle Allure CE" w:hAnsi="Belle Allure CE" w:cs="Belle Allure CE"/>
+                <w:b/>
+                <w:bCs/>
+                <w:color w:val="0A1F66"/>
+                <w:sz w:val="18"/>
+                <w:szCs w:val="18"/>
+              </w:rPr>
+              <w:t xml:space="preserve">non</w:t>
+            </w:r>
+          </w:p>
+        </w:tc>
+      </w:tr>
+      <w:tr>
+        <w:trPr>
+          <w:cantSplit/>
+        </w:trPr>
+        <w:tc>
+          <w:tcPr>
+            <w:tcW w:w="2050" w:type="dxa"/>
+            <w:vAlign w:val="center"/>
+          </w:tcPr>
+          <w:p>
+            <w:pPr>
+              <w:spacing w:before="20" w:after="20" w:line="240" w:lineRule="auto"/>
+              <w:jc w:val="center"/>
+            </w:pPr>
+            <w:r>
+              <w:rPr>
+                <w:rFonts w:ascii="Aptos" w:hAnsi="Aptos"/>
+                <w:sz w:val="18"/>
+                <w:szCs w:val="18"/>
+              </w:rPr>
+              <w:t xml:space="preserve">Une source chaude</w:t>
+            </w:r>
+          </w:p>
+        </w:tc>
+        <w:tc>
+          <w:tcPr>
+            <w:tcW w:w="2000" w:type="dxa"/>
+            <w:vAlign w:val="center"/>
+          </w:tcPr>
+          <w:p>
+            <w:pPr>
+              <w:spacing w:before="20" w:after="20" w:line="240" w:lineRule="auto"/>
+              <w:jc w:val="center"/>
+            </w:pPr>
+            <w:r>
+              <w:rPr>
+                <w:rFonts w:ascii="Belle Allure CE" w:hAnsi="Belle Allure CE" w:cs="Belle Allure CE"/>
+                <w:b/>
+                <w:bCs/>
+                <w:color w:val="0A1F66"/>
+                <w:sz w:val="18"/>
+                <w:szCs w:val="18"/>
+              </w:rPr>
+              <w:t xml:space="preserve">la chaleur de la Terre</w:t>
+            </w:r>
+          </w:p>
+        </w:tc>
+        <w:tc>
+          <w:tcPr>
+            <w:tcW w:w="1350" w:type="dxa"/>
+            <w:vAlign w:val="center"/>
+          </w:tcPr>
+          <w:p>
+            <w:pPr>
+              <w:spacing w:before="20" w:after="20" w:line="240" w:lineRule="auto"/>
+              <w:jc w:val="center"/>
+            </w:pPr>
+            <w:r>
+              <w:rPr>
+                <w:rFonts w:ascii="Belle Allure CE" w:hAnsi="Belle Allure CE" w:cs="Belle Allure CE"/>
+                <w:b/>
+                <w:bCs/>
+                <w:color w:val="0A1F66"/>
+                <w:sz w:val="18"/>
+                <w:szCs w:val="18"/>
+              </w:rPr>
+              <w:t xml:space="preserve">oui</w:t>
+            </w:r>
+          </w:p>
+        </w:tc>
+        <w:tc>
+          <w:tcPr>
+            <w:tcW w:w="2050" w:type="dxa"/>
+            <w:vAlign w:val="center"/>
+          </w:tcPr>
+          <w:p>
+            <w:pPr>
+              <w:spacing w:before="20" w:after="20" w:line="240" w:lineRule="auto"/>
+              <w:jc w:val="center"/>
+            </w:pPr>
+            <w:r>
+              <w:rPr>
+                <w:rFonts w:ascii="Belle Allure CE" w:hAnsi="Belle Allure CE" w:cs="Belle Allure CE"/>
+                <w:b/>
+                <w:bCs/>
+                <w:color w:val="0A1F66"/>
+                <w:sz w:val="18"/>
+                <w:szCs w:val="18"/>
+              </w:rPr>
+              <w:t xml:space="preserve">énergie thermique</w:t>
+            </w:r>
+          </w:p>
+        </w:tc>
+        <w:tc>
+          <w:tcPr>
+            <w:tcW w:w="3350" w:type="dxa"/>
+            <w:vAlign w:val="center"/>
+          </w:tcPr>
+          <w:p>
+            <w:pPr>
+              <w:spacing w:before="20" w:after="20" w:line="240" w:lineRule="auto"/>
+              <w:jc w:val="center"/>
+            </w:pPr>
+            <w:r>
+              <w:rPr>
+                <w:rFonts w:ascii="Belle Allure CE" w:hAnsi="Belle Allure CE" w:cs="Belle Allure CE"/>
+                <w:b/>
+                <w:bCs/>
+                <w:color w:val="0A1F66"/>
+                <w:sz w:val="18"/>
+                <w:szCs w:val="18"/>
+              </w:rPr>
+              <w:t xml:space="preserve">non</w:t>
+            </w:r>
+          </w:p>
+        </w:tc>
+      </w:tr>
+      <w:tr>
+        <w:trPr>
+          <w:cantSplit/>
+        </w:trPr>
+        <w:tc>
+          <w:tcPr>
+            <w:tcW w:w="2050" w:type="dxa"/>
+            <w:vAlign w:val="center"/>
+          </w:tcPr>
+          <w:p>
+            <w:pPr>
+              <w:spacing w:before="20" w:after="20" w:line="240" w:lineRule="auto"/>
+              <w:jc w:val="center"/>
+            </w:pPr>
+            <w:r>
+              <w:rPr>
+                <w:rFonts w:ascii="Aptos" w:hAnsi="Aptos"/>
+                <w:sz w:val="18"/>
+                <w:szCs w:val="18"/>
+              </w:rPr>
+              <w:t xml:space="preserve">Une centrale nucléaire</w:t>
+            </w:r>
+          </w:p>
+        </w:tc>
+        <w:tc>
+          <w:tcPr>
+            <w:tcW w:w="2000" w:type="dxa"/>
+            <w:vAlign w:val="center"/>
+          </w:tcPr>
+          <w:p>
+            <w:pPr>
+              <w:spacing w:before="20" w:after="20" w:line="240" w:lineRule="auto"/>
+              <w:jc w:val="center"/>
+            </w:pPr>
+            <w:r>
+              <w:rPr>
+                <w:rFonts w:ascii="Belle Allure CE" w:hAnsi="Belle Allure CE" w:cs="Belle Allure CE"/>
+                <w:b/>
+                <w:bCs/>
+                <w:color w:val="0A1F66"/>
+                <w:sz w:val="18"/>
+                <w:szCs w:val="18"/>
+              </w:rPr>
+              <w:t xml:space="preserve">l’uranium</w:t>
+            </w:r>
+          </w:p>
+        </w:tc>
+        <w:tc>
+          <w:tcPr>
+            <w:tcW w:w="1350" w:type="dxa"/>
+            <w:vAlign w:val="center"/>
+          </w:tcPr>
+          <w:p>
+            <w:pPr>
+              <w:spacing w:before="20" w:after="20" w:line="240" w:lineRule="auto"/>
+              <w:jc w:val="center"/>
+            </w:pPr>
+            <w:r>
+              <w:rPr>
+                <w:rFonts w:ascii="Belle Allure CE" w:hAnsi="Belle Allure CE" w:cs="Belle Allure CE"/>
+                <w:b/>
+                <w:bCs/>
+                <w:color w:val="0A1F66"/>
+                <w:sz w:val="18"/>
+                <w:szCs w:val="18"/>
+              </w:rPr>
+              <w:t xml:space="preserve">non</w:t>
+            </w:r>
+          </w:p>
+        </w:tc>
+        <w:tc>
+          <w:tcPr>
+            <w:tcW w:w="2050" w:type="dxa"/>
+            <w:vAlign w:val="center"/>
+          </w:tcPr>
+          <w:p>
+            <w:pPr>
+              <w:spacing w:before="20" w:after="20" w:line="240" w:lineRule="auto"/>
+              <w:jc w:val="center"/>
+            </w:pPr>
+            <w:r>
+              <w:rPr>
+                <w:rFonts w:ascii="Belle Allure CE" w:hAnsi="Belle Allure CE" w:cs="Belle Allure CE"/>
+                <w:b/>
+                <w:bCs/>
+                <w:color w:val="0A1F66"/>
+                <w:sz w:val="18"/>
+                <w:szCs w:val="18"/>
+              </w:rPr>
+              <w:t xml:space="preserve">énergie nucléaire</w:t>
+            </w:r>
+          </w:p>
+        </w:tc>
+        <w:tc>
+          <w:tcPr>
+            <w:tcW w:w="3350" w:type="dxa"/>
+            <w:vAlign w:val="center"/>
+          </w:tcPr>
+          <w:p>
+            <w:pPr>
+              <w:spacing w:before="20" w:after="20" w:line="240" w:lineRule="auto"/>
+              <w:jc w:val="center"/>
+            </w:pPr>
+            <w:r>
+              <w:rPr>
+                <w:rFonts w:ascii="Belle Allure CE" w:hAnsi="Belle Allure CE" w:cs="Belle Allure CE"/>
+                <w:b/>
+                <w:bCs/>
+                <w:color w:val="0A1F66"/>
+                <w:sz w:val="18"/>
+                <w:szCs w:val="18"/>
+              </w:rPr>
+              <w:t xml:space="preserve">oui : énergie nucléaire → énergie thermique → énergie électrique</w:t>
+            </w:r>
+          </w:p>
+        </w:tc>
+      </w:tr>
+      <w:tr>
+        <w:trPr>
+          <w:cantSplit/>
+        </w:trPr>
+        <w:tc>
+          <w:tcPr>
+            <w:tcW w:w="2050" w:type="dxa"/>
+            <w:vAlign w:val="center"/>
+          </w:tcPr>
+          <w:p>
+            <w:pPr>
+              <w:spacing w:before="20" w:after="20" w:line="240" w:lineRule="auto"/>
+              <w:jc w:val="center"/>
+            </w:pPr>
+            <w:r>
+              <w:rPr>
+                <w:rFonts w:ascii="Aptos" w:hAnsi="Aptos"/>
+                <w:sz w:val="18"/>
+                <w:szCs w:val="18"/>
+              </w:rPr>
+              <w:t xml:space="preserve">Des déchets</w:t>
+            </w:r>
+          </w:p>
+        </w:tc>
+        <w:tc>
+          <w:tcPr>
+            <w:tcW w:w="2000" w:type="dxa"/>
+            <w:vAlign w:val="center"/>
+          </w:tcPr>
+          <w:p>
+            <w:pPr>
+              <w:spacing w:before="20" w:after="20" w:line="240" w:lineRule="auto"/>
+              <w:jc w:val="center"/>
+            </w:pPr>
+            <w:r>
+              <w:rPr>
+                <w:rFonts w:ascii="Belle Allure CE" w:hAnsi="Belle Allure CE" w:cs="Belle Allure CE"/>
+                <w:b/>
+                <w:bCs/>
+                <w:color w:val="0A1F66"/>
+                <w:sz w:val="18"/>
+                <w:szCs w:val="18"/>
+              </w:rPr>
+              <w:t xml:space="preserve">les déchets</w:t>
+            </w:r>
+          </w:p>
+        </w:tc>
+        <w:tc>
+          <w:tcPr>
+            <w:tcW w:w="1350" w:type="dxa"/>
+            <w:vAlign w:val="center"/>
+          </w:tcPr>
+          <w:p>
+            <w:pPr>
+              <w:spacing w:before="20" w:after="20" w:line="240" w:lineRule="auto"/>
+              <w:jc w:val="center"/>
+            </w:pPr>
+            <w:r>
+              <w:rPr>
+                <w:rFonts w:ascii="Belle Allure CE" w:hAnsi="Belle Allure CE" w:cs="Belle Allure CE"/>
+                <w:b/>
+                <w:bCs/>
+                <w:color w:val="0A1F66"/>
+                <w:sz w:val="18"/>
+                <w:szCs w:val="18"/>
+              </w:rPr>
+              <w:t xml:space="preserve">oui</w:t>
+            </w:r>
+          </w:p>
+        </w:tc>
+        <w:tc>
+          <w:tcPr>
+            <w:tcW w:w="2050" w:type="dxa"/>
+            <w:vAlign w:val="center"/>
+          </w:tcPr>
+          <w:p>
+            <w:pPr>
+              <w:spacing w:before="20" w:after="20" w:line="240" w:lineRule="auto"/>
+              <w:jc w:val="center"/>
+            </w:pPr>
+            <w:r>
+              <w:rPr>
+                <w:rFonts w:ascii="Belle Allure CE" w:hAnsi="Belle Allure CE" w:cs="Belle Allure CE"/>
+                <w:b/>
+                <w:bCs/>
+                <w:color w:val="0A1F66"/>
+                <w:sz w:val="18"/>
+                <w:szCs w:val="18"/>
+              </w:rPr>
+              <w:t xml:space="preserve">énergie chimique</w:t>
+            </w:r>
+          </w:p>
+        </w:tc>
+        <w:tc>
+          <w:tcPr>
+            <w:tcW w:w="3350" w:type="dxa"/>
+            <w:vAlign w:val="center"/>
+          </w:tcPr>
+          <w:p>
+            <w:pPr>
+              <w:spacing w:before="20" w:after="20" w:line="240" w:lineRule="auto"/>
+              <w:jc w:val="center"/>
+            </w:pPr>
+            <w:r>
+              <w:rPr>
+                <w:rFonts w:ascii="Belle Allure CE" w:hAnsi="Belle Allure CE" w:cs="Belle Allure CE"/>
+                <w:b/>
+                <w:bCs/>
+                <w:color w:val="0A1F66"/>
+                <w:sz w:val="18"/>
+                <w:szCs w:val="18"/>
+              </w:rPr>
+              <w:t xml:space="preserve">non</w:t>
+            </w:r>
+          </w:p>
+        </w:tc>
+      </w:tr>
+      <w:tr>
+        <w:trPr>
+          <w:cantSplit/>
+        </w:trPr>
+        <w:tc>
+          <w:tcPr>
+            <w:tcW w:w="2050" w:type="dxa"/>
+            <w:vAlign w:val="center"/>
+          </w:tcPr>
+          <w:p>
+            <w:pPr>
+              <w:spacing w:before="20" w:after="20" w:line="240" w:lineRule="auto"/>
+              <w:jc w:val="center"/>
+            </w:pPr>
+            <w:r>
+              <w:rPr>
+                <w:rFonts w:ascii="Aptos" w:hAnsi="Aptos"/>
+                <w:sz w:val="18"/>
+                <w:szCs w:val="18"/>
+              </w:rPr>
+              <w:t xml:space="preserve">Un panneau photovoltaïque</w:t>
+            </w:r>
+          </w:p>
+        </w:tc>
+        <w:tc>
+          <w:tcPr>
+            <w:tcW w:w="2000" w:type="dxa"/>
+            <w:vAlign w:val="center"/>
+          </w:tcPr>
+          <w:p>
+            <w:pPr>
+              <w:spacing w:before="20" w:after="20" w:line="240" w:lineRule="auto"/>
+              <w:jc w:val="center"/>
+            </w:pPr>
+            <w:r>
+              <w:rPr>
+                <w:rFonts w:ascii="Belle Allure CE" w:hAnsi="Belle Allure CE" w:cs="Belle Allure CE"/>
+                <w:b/>
+                <w:bCs/>
+                <w:color w:val="0A1F66"/>
+                <w:sz w:val="18"/>
+                <w:szCs w:val="18"/>
+              </w:rPr>
+              <w:t xml:space="preserve">le Soleil</w:t>
+            </w:r>
+          </w:p>
+        </w:tc>
+        <w:tc>
+          <w:tcPr>
+            <w:tcW w:w="1350" w:type="dxa"/>
+            <w:vAlign w:val="center"/>
+          </w:tcPr>
+          <w:p>
+            <w:pPr>
+              <w:spacing w:before="20" w:after="20" w:line="240" w:lineRule="auto"/>
+              <w:jc w:val="center"/>
+            </w:pPr>
+            <w:r>
+              <w:rPr>
+                <w:rFonts w:ascii="Belle Allure CE" w:hAnsi="Belle Allure CE" w:cs="Belle Allure CE"/>
+                <w:b/>
+                <w:bCs/>
+                <w:color w:val="0A1F66"/>
+                <w:sz w:val="18"/>
+                <w:szCs w:val="18"/>
+              </w:rPr>
+              <w:t xml:space="preserve">oui</w:t>
+            </w:r>
+          </w:p>
+        </w:tc>
+        <w:tc>
+          <w:tcPr>
+            <w:tcW w:w="2050" w:type="dxa"/>
+            <w:vAlign w:val="center"/>
+          </w:tcPr>
+          <w:p>
+            <w:pPr>
+              <w:spacing w:before="20" w:after="20" w:line="240" w:lineRule="auto"/>
+              <w:jc w:val="center"/>
+            </w:pPr>
+            <w:r>
+              <w:rPr>
+                <w:rFonts w:ascii="Belle Allure CE" w:hAnsi="Belle Allure CE" w:cs="Belle Allure CE"/>
+                <w:b/>
+                <w:bCs/>
+                <w:color w:val="0A1F66"/>
+                <w:sz w:val="18"/>
+                <w:szCs w:val="18"/>
+              </w:rPr>
+              <w:t xml:space="preserve">énergie lumineuse (rayonnante)</w:t>
+            </w:r>
+          </w:p>
+        </w:tc>
+        <w:tc>
+          <w:tcPr>
+            <w:tcW w:w="3350" w:type="dxa"/>
+            <w:vAlign w:val="center"/>
+          </w:tcPr>
+          <w:p>
+            <w:pPr>
+              <w:spacing w:before="20" w:after="20" w:line="240" w:lineRule="auto"/>
+              <w:jc w:val="center"/>
+            </w:pPr>
+            <w:r>
+              <w:rPr>
+                <w:rFonts w:ascii="Belle Allure CE" w:hAnsi="Belle Allure CE" w:cs="Belle Allure CE"/>
+                <w:b/>
+                <w:bCs/>
+                <w:color w:val="0A1F66"/>
+                <w:sz w:val="18"/>
+                <w:szCs w:val="18"/>
+              </w:rPr>
+              <w:t xml:space="preserve">oui : il convertit l’énergie lumineuse en énergie électrique</w:t>
+            </w:r>
+          </w:p>
+        </w:tc>
+      </w:tr>
+      <w:tr>
+        <w:trPr>
+          <w:cantSplit/>
+        </w:trPr>
+        <w:tc>
+          <w:tcPr>
+            <w:tcW w:w="2050" w:type="dxa"/>
+            <w:vAlign w:val="center"/>
+          </w:tcPr>
+          <w:p>
+            <w:pPr>
+              <w:spacing w:before="20" w:after="20" w:line="240" w:lineRule="auto"/>
+              <w:jc w:val="center"/>
+            </w:pPr>
+            <w:r>
+              <w:rPr>
+                <w:rFonts w:ascii="Aptos" w:hAnsi="Aptos"/>
+                <w:sz w:val="18"/>
+                <w:szCs w:val="18"/>
+              </w:rPr>
+              <w:t xml:space="preserve">Des bouteilles de gaz</w:t>
+            </w:r>
+          </w:p>
+        </w:tc>
+        <w:tc>
+          <w:tcPr>
+            <w:tcW w:w="2000" w:type="dxa"/>
+            <w:vAlign w:val="center"/>
+          </w:tcPr>
+          <w:p>
+            <w:pPr>
+              <w:spacing w:before="20" w:after="20" w:line="240" w:lineRule="auto"/>
+              <w:jc w:val="center"/>
+            </w:pPr>
+            <w:r>
+              <w:rPr>
+                <w:rFonts w:ascii="Belle Allure CE" w:hAnsi="Belle Allure CE" w:cs="Belle Allure CE"/>
+                <w:b/>
+                <w:bCs/>
+                <w:color w:val="0A1F66"/>
+                <w:sz w:val="18"/>
+                <w:szCs w:val="18"/>
+              </w:rPr>
+              <w:t xml:space="preserve">le gaz</w:t>
+            </w:r>
+          </w:p>
+        </w:tc>
+        <w:tc>
+          <w:tcPr>
+            <w:tcW w:w="1350" w:type="dxa"/>
+            <w:vAlign w:val="center"/>
+          </w:tcPr>
+          <w:p>
+            <w:pPr>
+              <w:spacing w:before="20" w:after="20" w:line="240" w:lineRule="auto"/>
+              <w:jc w:val="center"/>
+            </w:pPr>
+            <w:r>
+              <w:rPr>
+                <w:rFonts w:ascii="Belle Allure CE" w:hAnsi="Belle Allure CE" w:cs="Belle Allure CE"/>
+                <w:b/>
+                <w:bCs/>
+                <w:color w:val="0A1F66"/>
+                <w:sz w:val="18"/>
+                <w:szCs w:val="18"/>
+              </w:rPr>
+              <w:t xml:space="preserve">non</w:t>
+            </w:r>
+          </w:p>
+        </w:tc>
+        <w:tc>
+          <w:tcPr>
+            <w:tcW w:w="2050" w:type="dxa"/>
+            <w:vAlign w:val="center"/>
+          </w:tcPr>
+          <w:p>
+            <w:pPr>
+              <w:spacing w:before="20" w:after="20" w:line="240" w:lineRule="auto"/>
+              <w:jc w:val="center"/>
+            </w:pPr>
+            <w:r>
+              <w:rPr>
+                <w:rFonts w:ascii="Belle Allure CE" w:hAnsi="Belle Allure CE" w:cs="Belle Allure CE"/>
+                <w:b/>
+                <w:bCs/>
+                <w:color w:val="0A1F66"/>
+                <w:sz w:val="18"/>
+                <w:szCs w:val="18"/>
+              </w:rPr>
+              <w:t xml:space="preserve">énergie chimique</w:t>
+            </w:r>
+          </w:p>
+        </w:tc>
+        <w:tc>
+          <w:tcPr>
+            <w:tcW w:w="3350" w:type="dxa"/>
+            <w:vAlign w:val="center"/>
+          </w:tcPr>
+          <w:p>
+            <w:pPr>
+              <w:spacing w:before="20" w:after="20" w:line="240" w:lineRule="auto"/>
+              <w:jc w:val="center"/>
+            </w:pPr>
+            <w:r>
+              <w:rPr>
+                <w:rFonts w:ascii="Belle Allure CE" w:hAnsi="Belle Allure CE" w:cs="Belle Allure CE"/>
+                <w:b/>
+                <w:bCs/>
+                <w:color w:val="0A1F66"/>
+                <w:sz w:val="18"/>
+                <w:szCs w:val="18"/>
+              </w:rPr>
+              <w:t xml:space="preserve">non</w:t>
+            </w:r>
+          </w:p>
+        </w:tc>
+      </w:tr>
+      <w:tr>
+        <w:trPr>
+          <w:cantSplit/>
+        </w:trPr>
+        <w:tc>
+          <w:tcPr>
+            <w:tcW w:w="2050" w:type="dxa"/>
+            <w:vAlign w:val="center"/>
+          </w:tcPr>
+          <w:p>
+            <w:pPr>
+              <w:spacing w:before="20" w:after="20" w:line="240" w:lineRule="auto"/>
+              <w:jc w:val="center"/>
+            </w:pPr>
+            <w:r>
+              <w:rPr>
+                <w:rFonts w:ascii="Aptos" w:hAnsi="Aptos"/>
+                <w:sz w:val="18"/>
+                <w:szCs w:val="18"/>
+              </w:rPr>
+              <w:t xml:space="preserve">Une mine de charbon</w:t>
+            </w:r>
+          </w:p>
+        </w:tc>
+        <w:tc>
+          <w:tcPr>
+            <w:tcW w:w="2000" w:type="dxa"/>
+            <w:vAlign w:val="center"/>
+          </w:tcPr>
+          <w:p>
+            <w:pPr>
+              <w:spacing w:before="20" w:after="20" w:line="240" w:lineRule="auto"/>
+              <w:jc w:val="center"/>
+            </w:pPr>
+            <w:r>
+              <w:rPr>
+                <w:rFonts w:ascii="Belle Allure CE" w:hAnsi="Belle Allure CE" w:cs="Belle Allure CE"/>
+                <w:b/>
+                <w:bCs/>
+                <w:color w:val="0A1F66"/>
+                <w:sz w:val="18"/>
+                <w:szCs w:val="18"/>
+              </w:rPr>
+              <w:t xml:space="preserve">le charbon</w:t>
+            </w:r>
+          </w:p>
+        </w:tc>
+        <w:tc>
+          <w:tcPr>
+            <w:tcW w:w="1350" w:type="dxa"/>
+            <w:vAlign w:val="center"/>
+          </w:tcPr>
+          <w:p>
+            <w:pPr>
+              <w:spacing w:before="20" w:after="20" w:line="240" w:lineRule="auto"/>
+              <w:jc w:val="center"/>
+            </w:pPr>
+            <w:r>
+              <w:rPr>
+                <w:rFonts w:ascii="Belle Allure CE" w:hAnsi="Belle Allure CE" w:cs="Belle Allure CE"/>
+                <w:b/>
+                <w:bCs/>
+                <w:color w:val="0A1F66"/>
+                <w:sz w:val="18"/>
+                <w:szCs w:val="18"/>
+              </w:rPr>
+              <w:t xml:space="preserve">non</w:t>
+            </w:r>
+          </w:p>
+        </w:tc>
+        <w:tc>
+          <w:tcPr>
+            <w:tcW w:w="2050" w:type="dxa"/>
+            <w:vAlign w:val="center"/>
+          </w:tcPr>
+          <w:p>
+            <w:pPr>
+              <w:spacing w:before="20" w:after="20" w:line="240" w:lineRule="auto"/>
+              <w:jc w:val="center"/>
+            </w:pPr>
+            <w:r>
+              <w:rPr>
+                <w:rFonts w:ascii="Belle Allure CE" w:hAnsi="Belle Allure CE" w:cs="Belle Allure CE"/>
+                <w:b/>
+                <w:bCs/>
+                <w:color w:val="0A1F66"/>
+                <w:sz w:val="18"/>
+                <w:szCs w:val="18"/>
+              </w:rPr>
+              <w:t xml:space="preserve">énergie chimique</w:t>
+            </w:r>
+          </w:p>
+        </w:tc>
+        <w:tc>
+          <w:tcPr>
+            <w:tcW w:w="3350" w:type="dxa"/>
+            <w:vAlign w:val="center"/>
+          </w:tcPr>
+          <w:p>
+            <w:pPr>
+              <w:spacing w:before="20" w:after="20" w:line="240" w:lineRule="auto"/>
+              <w:jc w:val="center"/>
+            </w:pPr>
+            <w:r>
+              <w:rPr>
+                <w:rFonts w:ascii="Belle Allure CE" w:hAnsi="Belle Allure CE" w:cs="Belle Allure CE"/>
+                <w:b/>
+                <w:bCs/>
+                <w:color w:val="0A1F66"/>
+                <w:sz w:val="18"/>
+                <w:szCs w:val="18"/>
+              </w:rPr>
+              <w:t xml:space="preserve">non</w:t>
+            </w:r>
+          </w:p>
+        </w:tc>
+      </w:tr>
+      <w:tr>
+        <w:trPr>
+          <w:cantSplit/>
+        </w:trPr>
+        <w:tc>
+          <w:tcPr>
+            <w:tcW w:w="2050" w:type="dxa"/>
+            <w:vAlign w:val="center"/>
+          </w:tcPr>
+          <w:p>
+            <w:pPr>
+              <w:spacing w:before="20" w:after="20" w:line="240" w:lineRule="auto"/>
+              <w:jc w:val="center"/>
+            </w:pPr>
+            <w:r>
+              <w:rPr>
+                <w:rFonts w:ascii="Aptos" w:hAnsi="Aptos"/>
+                <w:sz w:val="18"/>
+                <w:szCs w:val="18"/>
+              </w:rPr>
+              <w:t xml:space="preserve">Un moulin hydraulique</w:t>
+            </w:r>
+          </w:p>
+        </w:tc>
+        <w:tc>
+          <w:tcPr>
+            <w:tcW w:w="2000" w:type="dxa"/>
+            <w:vAlign w:val="center"/>
+          </w:tcPr>
+          <w:p>
+            <w:pPr>
+              <w:spacing w:before="20" w:after="20" w:line="240" w:lineRule="auto"/>
+              <w:jc w:val="center"/>
+            </w:pPr>
+            <w:r>
+              <w:rPr>
+                <w:rFonts w:ascii="Belle Allure CE" w:hAnsi="Belle Allure CE" w:cs="Belle Allure CE"/>
+                <w:b/>
+                <w:bCs/>
+                <w:color w:val="0A1F66"/>
+                <w:sz w:val="18"/>
+                <w:szCs w:val="18"/>
+              </w:rPr>
+              <w:t xml:space="preserve">l’eau de la rivière</w:t>
+            </w:r>
+          </w:p>
+        </w:tc>
+        <w:tc>
+          <w:tcPr>
+            <w:tcW w:w="1350" w:type="dxa"/>
+            <w:vAlign w:val="center"/>
+          </w:tcPr>
+          <w:p>
+            <w:pPr>
+              <w:spacing w:before="20" w:after="20" w:line="240" w:lineRule="auto"/>
+              <w:jc w:val="center"/>
+            </w:pPr>
+            <w:r>
+              <w:rPr>
+                <w:rFonts w:ascii="Belle Allure CE" w:hAnsi="Belle Allure CE" w:cs="Belle Allure CE"/>
+                <w:b/>
+                <w:bCs/>
+                <w:color w:val="0A1F66"/>
+                <w:sz w:val="18"/>
+                <w:szCs w:val="18"/>
+              </w:rPr>
+              <w:t xml:space="preserve">oui</w:t>
+            </w:r>
+          </w:p>
+        </w:tc>
+        <w:tc>
+          <w:tcPr>
+            <w:tcW w:w="2050" w:type="dxa"/>
+            <w:vAlign w:val="center"/>
+          </w:tcPr>
+          <w:p>
+            <w:pPr>
+              <w:spacing w:before="20" w:after="20" w:line="240" w:lineRule="auto"/>
+              <w:jc w:val="center"/>
+            </w:pPr>
+            <w:r>
+              <w:rPr>
+                <w:rFonts w:ascii="Belle Allure CE" w:hAnsi="Belle Allure CE" w:cs="Belle Allure CE"/>
+                <w:b/>
+                <w:bCs/>
+                <w:color w:val="0A1F66"/>
+                <w:sz w:val="18"/>
+                <w:szCs w:val="18"/>
+              </w:rPr>
+              <w:t xml:space="preserve">énergie cinétique (mécanique)</w:t>
+            </w:r>
+          </w:p>
+        </w:tc>
+        <w:tc>
+          <w:tcPr>
+            <w:tcW w:w="3350" w:type="dxa"/>
+            <w:vAlign w:val="center"/>
+          </w:tcPr>
+          <w:p>
+            <w:pPr>
+              <w:spacing w:before="20" w:after="20" w:line="240" w:lineRule="auto"/>
+              <w:jc w:val="center"/>
+            </w:pPr>
+            <w:r>
+              <w:rPr>
+                <w:rFonts w:ascii="Belle Allure CE" w:hAnsi="Belle Allure CE" w:cs="Belle Allure CE"/>
+                <w:b/>
+                <w:bCs/>
+                <w:color w:val="0A1F66"/>
+                <w:sz w:val="18"/>
+                <w:szCs w:val="18"/>
+              </w:rPr>
+              <w:t xml:space="preserve">oui : l’énergie cinétique de l’eau fait tourner la roue du moulin</w:t>
+            </w:r>
+          </w:p>
+        </w:tc>
+      </w:tr>
+      <w:tr>
+        <w:trPr>
+          <w:cantSplit/>
+        </w:trPr>
+        <w:tc>
+          <w:tcPr>
+            <w:tcW w:w="2050" w:type="dxa"/>
+            <w:vAlign w:val="center"/>
+          </w:tcPr>
+          <w:p>
+            <w:pPr>
+              <w:spacing w:before="20" w:after="20" w:line="240" w:lineRule="auto"/>
+              <w:jc w:val="center"/>
+            </w:pPr>
+            <w:r>
+              <w:rPr>
+                <w:rFonts w:ascii="Aptos" w:hAnsi="Aptos"/>
+                <w:sz w:val="18"/>
+                <w:szCs w:val="18"/>
+              </w:rPr>
+              <w:t xml:space="preserve">Une mine d’uranium</w:t>
+            </w:r>
+          </w:p>
+        </w:tc>
+        <w:tc>
+          <w:tcPr>
+            <w:tcW w:w="2000" w:type="dxa"/>
+            <w:vAlign w:val="center"/>
+          </w:tcPr>
+          <w:p>
+            <w:pPr>
+              <w:spacing w:before="20" w:after="20" w:line="240" w:lineRule="auto"/>
+              <w:jc w:val="center"/>
+            </w:pPr>
+            <w:r>
+              <w:rPr>
+                <w:rFonts w:ascii="Belle Allure CE" w:hAnsi="Belle Allure CE" w:cs="Belle Allure CE"/>
+                <w:b/>
+                <w:bCs/>
+                <w:color w:val="0A1F66"/>
+                <w:sz w:val="18"/>
+                <w:szCs w:val="18"/>
+              </w:rPr>
+              <w:t xml:space="preserve">l’uranium</w:t>
+            </w:r>
+          </w:p>
+        </w:tc>
+        <w:tc>
+          <w:tcPr>
+            <w:tcW w:w="1350" w:type="dxa"/>
+            <w:vAlign w:val="center"/>
+          </w:tcPr>
+          <w:p>
+            <w:pPr>
+              <w:spacing w:before="20" w:after="20" w:line="240" w:lineRule="auto"/>
+              <w:jc w:val="center"/>
+            </w:pPr>
+            <w:r>
+              <w:rPr>
+                <w:rFonts w:ascii="Belle Allure CE" w:hAnsi="Belle Allure CE" w:cs="Belle Allure CE"/>
+                <w:b/>
+                <w:bCs/>
+                <w:color w:val="0A1F66"/>
+                <w:sz w:val="18"/>
+                <w:szCs w:val="18"/>
+              </w:rPr>
+              <w:t xml:space="preserve">non</w:t>
+            </w:r>
+          </w:p>
+        </w:tc>
+        <w:tc>
+          <w:tcPr>
+            <w:tcW w:w="2050" w:type="dxa"/>
+            <w:vAlign w:val="center"/>
+          </w:tcPr>
+          <w:p>
+            <w:pPr>
+              <w:spacing w:before="20" w:after="20" w:line="240" w:lineRule="auto"/>
+              <w:jc w:val="center"/>
+            </w:pPr>
+            <w:r>
+              <w:rPr>
+                <w:rFonts w:ascii="Belle Allure CE" w:hAnsi="Belle Allure CE" w:cs="Belle Allure CE"/>
+                <w:b/>
+                <w:bCs/>
+                <w:color w:val="0A1F66"/>
+                <w:sz w:val="18"/>
+                <w:szCs w:val="18"/>
+              </w:rPr>
+              <w:t xml:space="preserve">énergie nucléaire</w:t>
+            </w:r>
+          </w:p>
+        </w:tc>
+        <w:tc>
+          <w:tcPr>
+            <w:tcW w:w="3350" w:type="dxa"/>
+            <w:vAlign w:val="center"/>
+          </w:tcPr>
+          <w:p>
+            <w:pPr>
+              <w:spacing w:before="20" w:after="20" w:line="240" w:lineRule="auto"/>
+              <w:jc w:val="center"/>
+            </w:pPr>
+            <w:r>
+              <w:rPr>
+                <w:rFonts w:ascii="Belle Allure CE" w:hAnsi="Belle Allure CE" w:cs="Belle Allure CE"/>
+                <w:b/>
+                <w:bCs/>
+                <w:color w:val="0A1F66"/>
+                <w:sz w:val="18"/>
+                <w:szCs w:val="18"/>
+              </w:rPr>
+              <w:t xml:space="preserve">non</w:t>
+            </w:r>
+          </w:p>
+        </w:tc>
+      </w:tr>
+      <w:tr>
+        <w:trPr>
+          <w:cantSplit/>
+        </w:trPr>
+        <w:tc>
+          <w:tcPr>
+            <w:tcW w:w="2050" w:type="dxa"/>
+            <w:vAlign w:val="center"/>
+          </w:tcPr>
+          <w:p>
+            <w:pPr>
+              <w:spacing w:before="20" w:after="20" w:line="240" w:lineRule="auto"/>
+              <w:jc w:val="center"/>
+            </w:pPr>
+            <w:r>
+              <w:rPr>
+                <w:rFonts w:ascii="Aptos" w:hAnsi="Aptos"/>
+                <w:sz w:val="18"/>
+                <w:szCs w:val="18"/>
+              </w:rPr>
+              <w:t xml:space="preserve">Du pain</w:t>
+            </w:r>
+          </w:p>
+        </w:tc>
+        <w:tc>
+          <w:tcPr>
+            <w:tcW w:w="2000" w:type="dxa"/>
+            <w:vAlign w:val="center"/>
+          </w:tcPr>
+          <w:p>
+            <w:pPr>
+              <w:spacing w:before="20" w:after="20" w:line="240" w:lineRule="auto"/>
+              <w:jc w:val="center"/>
+            </w:pPr>
+            <w:r>
+              <w:rPr>
+                <w:rFonts w:ascii="Belle Allure CE" w:hAnsi="Belle Allure CE" w:cs="Belle Allure CE"/>
+                <w:b/>
+                <w:bCs/>
+                <w:color w:val="0A1F66"/>
+                <w:sz w:val="18"/>
+                <w:szCs w:val="18"/>
+              </w:rPr>
+              <w:t xml:space="preserve">les aliments (le blé)</w:t>
+            </w:r>
+          </w:p>
+        </w:tc>
+        <w:tc>
+          <w:tcPr>
+            <w:tcW w:w="1350" w:type="dxa"/>
+            <w:vAlign w:val="center"/>
+          </w:tcPr>
+          <w:p>
+            <w:pPr>
+              <w:spacing w:before="20" w:after="20" w:line="240" w:lineRule="auto"/>
+              <w:jc w:val="center"/>
+            </w:pPr>
+            <w:r>
+              <w:rPr>
+                <w:rFonts w:ascii="Belle Allure CE" w:hAnsi="Belle Allure CE" w:cs="Belle Allure CE"/>
+                <w:b/>
+                <w:bCs/>
+                <w:color w:val="0A1F66"/>
+                <w:sz w:val="18"/>
+                <w:szCs w:val="18"/>
+              </w:rPr>
+              <w:t xml:space="preserve">oui</w:t>
+            </w:r>
+          </w:p>
+        </w:tc>
+        <w:tc>
+          <w:tcPr>
+            <w:tcW w:w="2050" w:type="dxa"/>
+            <w:vAlign w:val="center"/>
+          </w:tcPr>
+          <w:p>
+            <w:pPr>
+              <w:spacing w:before="20" w:after="20" w:line="240" w:lineRule="auto"/>
+              <w:jc w:val="center"/>
+            </w:pPr>
+            <w:r>
+              <w:rPr>
+                <w:rFonts w:ascii="Belle Allure CE" w:hAnsi="Belle Allure CE" w:cs="Belle Allure CE"/>
+                <w:b/>
+                <w:bCs/>
+                <w:color w:val="0A1F66"/>
+                <w:sz w:val="18"/>
+                <w:szCs w:val="18"/>
+              </w:rPr>
+              <w:t xml:space="preserve">énergie chimique</w:t>
+            </w:r>
+          </w:p>
+        </w:tc>
+        <w:tc>
+          <w:tcPr>
+            <w:tcW w:w="3350" w:type="dxa"/>
+            <w:vAlign w:val="center"/>
+          </w:tcPr>
+          <w:p>
+            <w:pPr>
+              <w:spacing w:before="20" w:after="20" w:line="240" w:lineRule="auto"/>
+              <w:jc w:val="center"/>
+            </w:pPr>
+            <w:r>
+              <w:rPr>
+                <w:rFonts w:ascii="Belle Allure CE" w:hAnsi="Belle Allure CE" w:cs="Belle Allure CE"/>
+                <w:b/>
+                <w:bCs/>
+                <w:color w:val="0A1F66"/>
+                <w:sz w:val="18"/>
+                <w:szCs w:val="18"/>
+              </w:rPr>
+              <w:t xml:space="preserve">non</w:t>
+            </w:r>
+          </w:p>
+        </w:tc>
+      </w:tr>
+      <w:tr>
+        <w:trPr>
+          <w:cantSplit/>
+        </w:trPr>
+        <w:tc>
+          <w:tcPr>
+            <w:tcW w:w="2050" w:type="dxa"/>
+            <w:vAlign w:val="center"/>
+          </w:tcPr>
+          <w:p>
+            <w:pPr>
+              <w:spacing w:before="20" w:after="20" w:line="240" w:lineRule="auto"/>
+              <w:jc w:val="center"/>
+            </w:pPr>
+            <w:r>
+              <w:rPr>
+                <w:rFonts w:ascii="Aptos" w:hAnsi="Aptos"/>
+                <w:sz w:val="18"/>
+                <w:szCs w:val="18"/>
+              </w:rPr>
+              <w:t xml:space="preserve">Une horloge</w:t>
+            </w:r>
+          </w:p>
+        </w:tc>
+        <w:tc>
+          <w:tcPr>
+            <w:tcW w:w="2000" w:type="dxa"/>
+            <w:vAlign w:val="center"/>
+          </w:tcPr>
+          <w:p>
+            <w:pPr>
+              <w:spacing w:before="20" w:after="20" w:line="240" w:lineRule="auto"/>
+              <w:jc w:val="center"/>
+            </w:pPr>
+            <w:r>
+              <w:rPr>
+                <w:rFonts w:ascii="Belle Allure CE" w:hAnsi="Belle Allure CE" w:cs="Belle Allure CE"/>
+                <w:b/>
+                <w:bCs/>
+                <w:color w:val="0A1F66"/>
+                <w:sz w:val="18"/>
+                <w:szCs w:val="18"/>
+              </w:rPr>
+              <w:t xml:space="preserve">les poids qu’on remonte</w:t>
+            </w:r>
+          </w:p>
+        </w:tc>
+        <w:tc>
+          <w:tcPr>
+            <w:tcW w:w="1350" w:type="dxa"/>
+            <w:vAlign w:val="center"/>
+          </w:tcPr>
+          <w:p>
+            <w:pPr>
+              <w:spacing w:before="20" w:after="20" w:line="240" w:lineRule="auto"/>
+              <w:jc w:val="center"/>
+            </w:pPr>
+            <w:r>
+              <w:rPr>
+                <w:rFonts w:ascii="Belle Allure CE" w:hAnsi="Belle Allure CE" w:cs="Belle Allure CE"/>
+                <w:b/>
+                <w:bCs/>
+                <w:color w:val="0A1F66"/>
+                <w:sz w:val="18"/>
+                <w:szCs w:val="18"/>
+              </w:rPr>
+              <w:t xml:space="preserve">–</w:t>
+            </w:r>
+          </w:p>
+        </w:tc>
+        <w:tc>
+          <w:tcPr>
+            <w:tcW w:w="2050" w:type="dxa"/>
+            <w:vAlign w:val="center"/>
+          </w:tcPr>
+          <w:p>
+            <w:pPr>
+              <w:spacing w:before="20" w:after="20" w:line="240" w:lineRule="auto"/>
+              <w:jc w:val="center"/>
+            </w:pPr>
+            <w:r>
+              <w:rPr>
+                <w:rFonts w:ascii="Belle Allure CE" w:hAnsi="Belle Allure CE" w:cs="Belle Allure CE"/>
+                <w:b/>
+                <w:bCs/>
+                <w:color w:val="0A1F66"/>
+                <w:sz w:val="18"/>
+                <w:szCs w:val="18"/>
+              </w:rPr>
+              <w:t xml:space="preserve">énergie de pesanteur (mécanique)</w:t>
+            </w:r>
+          </w:p>
+        </w:tc>
+        <w:tc>
+          <w:tcPr>
+            <w:tcW w:w="3350" w:type="dxa"/>
+            <w:vAlign w:val="center"/>
+          </w:tcPr>
+          <w:p>
+            <w:pPr>
+              <w:spacing w:before="20" w:after="20" w:line="240" w:lineRule="auto"/>
+              <w:jc w:val="center"/>
+            </w:pPr>
+            <w:r>
+              <w:rPr>
+                <w:rFonts w:ascii="Belle Allure CE" w:hAnsi="Belle Allure CE" w:cs="Belle Allure CE"/>
+                <w:b/>
+                <w:bCs/>
+                <w:color w:val="0A1F66"/>
+                <w:sz w:val="18"/>
+                <w:szCs w:val="18"/>
+              </w:rPr>
+              <w:t xml:space="preserve">oui : l’énergie de pesanteur des poids fait bouger les aiguilles (énergie cinétique)</w:t>
+            </w:r>
+          </w:p>
+        </w:tc>
+      </w:tr>
+    </w:tbl>
+    <w:p>
+      <w:pPr>
+        <w:spacing w:before="0" w:after="120"/>
+      </w:pPr>
+    </w:p>
+    <w:p>
+      <w:pPr>
+        <w:keepNext/>
         <w:spacing w:line="276" w:lineRule="auto"/>
         <w:jc w:val="both"/>
         <w:rPr>
@@ -2909,78 +4875,19 @@
     </w:p>
     <w:p>
       <w:pPr>
-        <w:spacing w:line="360" w:lineRule="auto"/>
+        <w:spacing w:before="60" w:after="60" w:line="360" w:lineRule="auto"/>
         <w:jc w:val="both"/>
-        <w:rPr>
-          <w:rFonts w:asciiTheme="minorHAnsi" w:hAnsiTheme="minorHAnsi" w:cstheme="minorHAnsi"/>
-          <w:sz w:val="22"/>
-          <w:szCs w:val="22"/>
-        </w:rPr>
       </w:pPr>
       <w:r>
         <w:rPr>
-          <w:rFonts w:asciiTheme="minorHAnsi" w:hAnsiTheme="minorHAnsi" w:cstheme="minorHAnsi"/>
-          <w:sz w:val="22"/>
-          <w:szCs w:val="22"/>
+          <w:rFonts w:ascii="Belle Allure CE" w:hAnsi="Belle Allure CE" w:cs="Belle Allure CE"/>
+          <w:b/>
+          <w:bCs/>
+          <w:color w:val="0A1F66"/>
+          <w:sz w:val="20"/>
+          <w:szCs w:val="20"/>
         </w:rPr>
-        <w:t>…………………………………………………………………………………………………………………………………………………………………………………………..</w:t>
-      </w:r>
-    </w:p>
-    <w:p>
-      <w:pPr>
-        <w:spacing w:line="360" w:lineRule="auto"/>
-        <w:jc w:val="both"/>
-        <w:rPr>
-          <w:rFonts w:asciiTheme="minorHAnsi" w:hAnsiTheme="minorHAnsi" w:cstheme="minorHAnsi"/>
-          <w:sz w:val="22"/>
-          <w:szCs w:val="22"/>
-        </w:rPr>
-      </w:pPr>
-      <w:r>
-        <w:rPr>
-          <w:rFonts w:asciiTheme="minorHAnsi" w:hAnsiTheme="minorHAnsi" w:cstheme="minorHAnsi"/>
-          <w:sz w:val="22"/>
-          <w:szCs w:val="22"/>
-        </w:rPr>
-        <w:t>…………………………………………………………………………………………………………………………………………………………………………………………..</w:t>
-      </w:r>
-    </w:p>
-    <w:p>
-      <w:pPr>
-        <w:spacing w:line="360" w:lineRule="auto"/>
-        <w:jc w:val="both"/>
-        <w:rPr>
-          <w:rFonts w:asciiTheme="minorHAnsi" w:hAnsiTheme="minorHAnsi" w:cstheme="minorHAnsi"/>
-          <w:sz w:val="22"/>
-          <w:szCs w:val="22"/>
-        </w:rPr>
-      </w:pPr>
-      <w:r>
-        <w:rPr>
-          <w:rFonts w:asciiTheme="minorHAnsi" w:hAnsiTheme="minorHAnsi" w:cstheme="minorHAnsi"/>
-          <w:sz w:val="22"/>
-          <w:szCs w:val="22"/>
-        </w:rPr>
-        <w:t>…………………………………………………………………………………………………………………………………………………………………………………………..</w:t>
-      </w:r>
-    </w:p>
-    <w:p>
-      <w:pPr>
-        <w:spacing w:line="360" w:lineRule="auto"/>
-        <w:jc w:val="both"/>
-        <w:rPr>
-          <w:rFonts w:asciiTheme="minorHAnsi" w:hAnsiTheme="minorHAnsi" w:cstheme="minorHAnsi"/>
-          <w:sz w:val="22"/>
-          <w:szCs w:val="22"/>
-        </w:rPr>
-      </w:pPr>
-      <w:r>
-        <w:rPr>
-          <w:rFonts w:asciiTheme="minorHAnsi" w:hAnsiTheme="minorHAnsi" w:cstheme="minorHAnsi"/>
-          <w:sz w:val="22"/>
-          <w:szCs w:val="22"/>
-        </w:rPr>
-        <w:t>…………………………………………………………………………………………………………………………………………………………………………………………..</w:t>
+        <w:t xml:space="preserve">Non, ils n’utilisent pas la même énergie. Le tramway fonctionne avec l’énergie électrique : il est relié aux câbles au-dessus des rails. Le bus de tourisme fonctionne avec l’énergie chimique du gazole, qui vient du pétrole et qui brûle dans son moteur. Les deux convertissent cette énergie en énergie cinétique pour avancer. Mais leurs ressources ne sont pas les mêmes : le pétrole est une ressource non renouvelable, alors que l’électricité peut être produite avec des ressources renouvelables comme le vent ou le Soleil.</w:t>
       </w:r>
     </w:p>
     <w:p>
@@ -2998,6 +4905,16 @@
           <w:rFonts w:asciiTheme="minorHAnsi" w:hAnsiTheme="minorHAnsi" w:cstheme="minorHAnsi"/>
           <w:sz w:val="12"/>
           <w:szCs w:val="12"/>
+        </w:rPr>
+      </w:pPr>
+    </w:p>
+    <w:p>
+      <w:pPr>
+        <w:pageBreakBefore/>
+        <w:spacing w:before="0" w:after="0" w:line="20" w:lineRule="exact"/>
+        <w:rPr>
+          <w:sz w:val="2"/>
+          <w:szCs w:val="2"/>
         </w:rPr>
       </w:pPr>
     </w:p>
@@ -3068,7 +4985,7 @@
               <w:spacing w:before="60"/>
               <w:jc w:val="center"/>
               <w:rPr>
-                <w:rFonts w:ascii="BelleAllureCE" w:hAnsi="BelleAllureCE"/>
+                <w:rFonts w:ascii="Belle Allure CE" w:hAnsi="Belle Allure CE"/>
                 <w:b/>
                 <w:bCs/>
                 <w:noProof/>
@@ -3078,7 +4995,7 @@
             </w:pPr>
             <w:r>
               <w:rPr>
-                <w:rFonts w:ascii="BelleAllureCE" w:hAnsi="BelleAllureCE" w:cstheme="minorHAnsi"/>
+                <w:rFonts w:ascii="Belle Allure CE" w:hAnsi="Belle Allure CE" w:cstheme="minorHAnsi"/>
                 <w:b/>
                 <w:bCs/>
                 <w:sz w:val="16"/>
@@ -3098,7 +5015,7 @@
               <w:spacing w:before="60"/>
               <w:jc w:val="center"/>
               <w:rPr>
-                <w:rFonts w:ascii="BelleAllureCE" w:hAnsi="BelleAllureCE"/>
+                <w:rFonts w:ascii="Belle Allure CE" w:hAnsi="Belle Allure CE"/>
                 <w:b/>
                 <w:bCs/>
                 <w:noProof/>
@@ -3108,7 +5025,7 @@
             </w:pPr>
             <w:r>
               <w:rPr>
-                <w:rFonts w:ascii="BelleAllureCE" w:hAnsi="BelleAllureCE" w:cstheme="minorHAnsi"/>
+                <w:rFonts w:ascii="Belle Allure CE" w:hAnsi="Belle Allure CE" w:cstheme="minorHAnsi"/>
                 <w:b/>
                 <w:bCs/>
                 <w:sz w:val="16"/>
@@ -3128,7 +5045,7 @@
               <w:spacing w:before="60"/>
               <w:jc w:val="center"/>
               <w:rPr>
-                <w:rFonts w:ascii="BelleAllureCE" w:hAnsi="BelleAllureCE" w:cstheme="minorHAnsi"/>
+                <w:rFonts w:ascii="Belle Allure CE" w:hAnsi="Belle Allure CE" w:cstheme="minorHAnsi"/>
                 <w:b/>
                 <w:bCs/>
                 <w:sz w:val="16"/>
@@ -3137,7 +5054,7 @@
             </w:pPr>
             <w:r>
               <w:rPr>
-                <w:rFonts w:ascii="BelleAllureCE" w:hAnsi="BelleAllureCE" w:cstheme="minorHAnsi"/>
+                <w:rFonts w:ascii="Belle Allure CE" w:hAnsi="Belle Allure CE" w:cstheme="minorHAnsi"/>
                 <w:b/>
                 <w:bCs/>
                 <w:sz w:val="16"/>
@@ -3162,7 +5079,7 @@
               <w:spacing w:before="120" w:after="120"/>
               <w:jc w:val="center"/>
               <w:rPr>
-                <w:rFonts w:ascii="BelleAllureCE" w:hAnsi="BelleAllureCE" w:cstheme="minorHAnsi"/>
+                <w:rFonts w:ascii="Belle Allure CE" w:hAnsi="Belle Allure CE" w:cstheme="minorHAnsi"/>
                 <w:b/>
                 <w:bCs/>
                 <w:sz w:val="16"/>
@@ -3171,7 +5088,7 @@
             </w:pPr>
             <w:r>
               <w:rPr>
-                <w:rFonts w:ascii="BelleAllureCE" w:hAnsi="BelleAllureCE"/>
+                <w:rFonts w:ascii="Belle Allure CE" w:hAnsi="Belle Allure CE"/>
                 <w:b/>
                 <w:bCs/>
                 <w:noProof/>
@@ -3226,7 +5143,7 @@
               <w:spacing w:before="120" w:after="120"/>
               <w:jc w:val="center"/>
               <w:rPr>
-                <w:rFonts w:ascii="BelleAllureCE" w:hAnsi="BelleAllureCE" w:cstheme="minorHAnsi"/>
+                <w:rFonts w:ascii="Belle Allure CE" w:hAnsi="Belle Allure CE" w:cstheme="minorHAnsi"/>
                 <w:b/>
                 <w:bCs/>
                 <w:sz w:val="16"/>
@@ -3235,7 +5152,7 @@
             </w:pPr>
             <w:r>
               <w:rPr>
-                <w:rFonts w:ascii="BelleAllureCE" w:hAnsi="BelleAllureCE"/>
+                <w:rFonts w:ascii="Belle Allure CE" w:hAnsi="Belle Allure CE"/>
                 <w:b/>
                 <w:bCs/>
                 <w:noProof/>
@@ -3303,7 +5220,7 @@
               <w:spacing w:before="120" w:after="120"/>
               <w:jc w:val="center"/>
               <w:rPr>
-                <w:rFonts w:ascii="BelleAllureCE" w:hAnsi="BelleAllureCE" w:cstheme="minorHAnsi"/>
+                <w:rFonts w:ascii="Belle Allure CE" w:hAnsi="Belle Allure CE" w:cstheme="minorHAnsi"/>
                 <w:b/>
                 <w:bCs/>
                 <w:sz w:val="16"/>
@@ -3312,7 +5229,7 @@
             </w:pPr>
             <w:r>
               <w:rPr>
-                <w:rFonts w:ascii="BelleAllureCE" w:hAnsi="BelleAllureCE"/>
+                <w:rFonts w:ascii="Belle Allure CE" w:hAnsi="Belle Allure CE"/>
                 <w:b/>
                 <w:bCs/>
                 <w:noProof/>
@@ -3387,7 +5304,7 @@
               <w:spacing w:before="60" w:after="60"/>
               <w:jc w:val="center"/>
               <w:rPr>
-                <w:rFonts w:ascii="BelleAllureCE" w:hAnsi="BelleAllureCE" w:cstheme="minorHAnsi"/>
+                <w:rFonts w:ascii="Belle Allure CE" w:hAnsi="Belle Allure CE" w:cstheme="minorHAnsi"/>
                 <w:b/>
                 <w:bCs/>
                 <w:sz w:val="16"/>
@@ -3396,7 +5313,7 @@
             </w:pPr>
             <w:r>
               <w:rPr>
-                <w:rFonts w:ascii="BelleAllureCE" w:hAnsi="BelleAllureCE" w:cstheme="minorHAnsi"/>
+                <w:rFonts w:ascii="Belle Allure CE" w:hAnsi="Belle Allure CE" w:cstheme="minorHAnsi"/>
                 <w:b/>
                 <w:bCs/>
                 <w:sz w:val="16"/>
@@ -3416,7 +5333,7 @@
               <w:spacing w:before="60" w:after="60"/>
               <w:jc w:val="center"/>
               <w:rPr>
-                <w:rFonts w:ascii="BelleAllureCE" w:hAnsi="BelleAllureCE" w:cstheme="minorHAnsi"/>
+                <w:rFonts w:ascii="Belle Allure CE" w:hAnsi="Belle Allure CE" w:cstheme="minorHAnsi"/>
                 <w:b/>
                 <w:bCs/>
                 <w:sz w:val="16"/>
@@ -3425,7 +5342,7 @@
             </w:pPr>
             <w:r>
               <w:rPr>
-                <w:rFonts w:ascii="BelleAllureCE" w:hAnsi="BelleAllureCE" w:cstheme="minorHAnsi"/>
+                <w:rFonts w:ascii="Belle Allure CE" w:hAnsi="Belle Allure CE" w:cstheme="minorHAnsi"/>
                 <w:b/>
                 <w:bCs/>
                 <w:sz w:val="16"/>
@@ -3445,7 +5362,7 @@
               <w:spacing w:before="60" w:after="60"/>
               <w:jc w:val="center"/>
               <w:rPr>
-                <w:rFonts w:ascii="BelleAllureCE" w:hAnsi="BelleAllureCE" w:cstheme="minorHAnsi"/>
+                <w:rFonts w:ascii="Belle Allure CE" w:hAnsi="Belle Allure CE" w:cstheme="minorHAnsi"/>
                 <w:b/>
                 <w:bCs/>
                 <w:sz w:val="16"/>
@@ -3454,7 +5371,7 @@
             </w:pPr>
             <w:r>
               <w:rPr>
-                <w:rFonts w:ascii="BelleAllureCE" w:hAnsi="BelleAllureCE" w:cstheme="minorHAnsi"/>
+                <w:rFonts w:ascii="Belle Allure CE" w:hAnsi="Belle Allure CE" w:cstheme="minorHAnsi"/>
                 <w:b/>
                 <w:bCs/>
                 <w:sz w:val="16"/>
@@ -3479,7 +5396,7 @@
               <w:spacing w:before="120" w:after="120"/>
               <w:jc w:val="center"/>
               <w:rPr>
-                <w:rFonts w:ascii="BelleAllureCE" w:hAnsi="BelleAllureCE" w:cstheme="minorHAnsi"/>
+                <w:rFonts w:ascii="Belle Allure CE" w:hAnsi="Belle Allure CE" w:cstheme="minorHAnsi"/>
                 <w:b/>
                 <w:bCs/>
                 <w:sz w:val="16"/>
@@ -3488,7 +5405,7 @@
             </w:pPr>
             <w:r>
               <w:rPr>
-                <w:rFonts w:ascii="BelleAllureCE" w:hAnsi="BelleAllureCE"/>
+                <w:rFonts w:ascii="Belle Allure CE" w:hAnsi="Belle Allure CE"/>
                 <w:b/>
                 <w:bCs/>
                 <w:noProof/>
@@ -3558,7 +5475,7 @@
               <w:spacing w:before="120" w:after="120"/>
               <w:jc w:val="center"/>
               <w:rPr>
-                <w:rFonts w:ascii="BelleAllureCE" w:hAnsi="BelleAllureCE" w:cstheme="minorHAnsi"/>
+                <w:rFonts w:ascii="Belle Allure CE" w:hAnsi="Belle Allure CE" w:cstheme="minorHAnsi"/>
                 <w:b/>
                 <w:bCs/>
                 <w:sz w:val="16"/>
@@ -3567,7 +5484,7 @@
             </w:pPr>
             <w:r>
               <w:rPr>
-                <w:rFonts w:ascii="BelleAllureCE" w:hAnsi="BelleAllureCE"/>
+                <w:rFonts w:ascii="Belle Allure CE" w:hAnsi="Belle Allure CE"/>
                 <w:b/>
                 <w:bCs/>
                 <w:noProof/>
@@ -3629,7 +5546,7 @@
               <w:spacing w:before="120" w:after="120"/>
               <w:jc w:val="center"/>
               <w:rPr>
-                <w:rFonts w:ascii="BelleAllureCE" w:hAnsi="BelleAllureCE" w:cstheme="minorHAnsi"/>
+                <w:rFonts w:ascii="Belle Allure CE" w:hAnsi="Belle Allure CE" w:cstheme="minorHAnsi"/>
                 <w:b/>
                 <w:bCs/>
                 <w:sz w:val="16"/>
@@ -3638,7 +5555,7 @@
             </w:pPr>
             <w:r>
               <w:rPr>
-                <w:rFonts w:ascii="BelleAllureCE" w:hAnsi="BelleAllureCE"/>
+                <w:rFonts w:ascii="Belle Allure CE" w:hAnsi="Belle Allure CE"/>
                 <w:b/>
                 <w:bCs/>
                 <w:noProof/>
@@ -3697,7 +5614,7 @@
             <w:pPr>
               <w:jc w:val="center"/>
               <w:rPr>
-                <w:rFonts w:ascii="BelleAllureCE" w:hAnsi="BelleAllureCE" w:cstheme="minorHAnsi"/>
+                <w:rFonts w:ascii="Belle Allure CE" w:hAnsi="Belle Allure CE" w:cstheme="minorHAnsi"/>
                 <w:b/>
                 <w:bCs/>
                 <w:sz w:val="16"/>
@@ -3706,7 +5623,7 @@
             </w:pPr>
             <w:r>
               <w:rPr>
-                <w:rFonts w:ascii="BelleAllureCE" w:hAnsi="BelleAllureCE" w:cstheme="minorHAnsi"/>
+                <w:rFonts w:ascii="Belle Allure CE" w:hAnsi="Belle Allure CE" w:cstheme="minorHAnsi"/>
                 <w:b/>
                 <w:bCs/>
                 <w:sz w:val="16"/>
@@ -3725,7 +5642,7 @@
             <w:pPr>
               <w:jc w:val="center"/>
               <w:rPr>
-                <w:rFonts w:ascii="BelleAllureCE" w:hAnsi="BelleAllureCE" w:cstheme="minorHAnsi"/>
+                <w:rFonts w:ascii="Belle Allure CE" w:hAnsi="Belle Allure CE" w:cstheme="minorHAnsi"/>
                 <w:b/>
                 <w:bCs/>
                 <w:sz w:val="16"/>
@@ -3734,7 +5651,7 @@
             </w:pPr>
             <w:r>
               <w:rPr>
-                <w:rFonts w:ascii="BelleAllureCE" w:hAnsi="BelleAllureCE" w:cstheme="minorHAnsi"/>
+                <w:rFonts w:ascii="Belle Allure CE" w:hAnsi="Belle Allure CE" w:cstheme="minorHAnsi"/>
                 <w:b/>
                 <w:bCs/>
                 <w:sz w:val="16"/>
@@ -3753,7 +5670,7 @@
             <w:pPr>
               <w:jc w:val="center"/>
               <w:rPr>
-                <w:rFonts w:ascii="BelleAllureCE" w:hAnsi="BelleAllureCE" w:cstheme="minorHAnsi"/>
+                <w:rFonts w:ascii="Belle Allure CE" w:hAnsi="Belle Allure CE" w:cstheme="minorHAnsi"/>
                 <w:b/>
                 <w:bCs/>
                 <w:sz w:val="16"/>
@@ -3762,7 +5679,7 @@
             </w:pPr>
             <w:r>
               <w:rPr>
-                <w:rFonts w:ascii="BelleAllureCE" w:hAnsi="BelleAllureCE" w:cstheme="minorHAnsi"/>
+                <w:rFonts w:ascii="Belle Allure CE" w:hAnsi="Belle Allure CE" w:cstheme="minorHAnsi"/>
                 <w:b/>
                 <w:bCs/>
                 <w:sz w:val="16"/>
@@ -3787,7 +5704,7 @@
               <w:spacing w:before="120" w:after="120"/>
               <w:jc w:val="center"/>
               <w:rPr>
-                <w:rFonts w:ascii="BelleAllureCE" w:hAnsi="BelleAllureCE" w:cstheme="minorHAnsi"/>
+                <w:rFonts w:ascii="Belle Allure CE" w:hAnsi="Belle Allure CE" w:cstheme="minorHAnsi"/>
                 <w:b/>
                 <w:bCs/>
                 <w:sz w:val="16"/>
@@ -3796,7 +5713,7 @@
             </w:pPr>
             <w:r>
               <w:rPr>
-                <w:rFonts w:ascii="BelleAllureCE" w:hAnsi="BelleAllureCE"/>
+                <w:rFonts w:ascii="Belle Allure CE" w:hAnsi="Belle Allure CE"/>
                 <w:b/>
                 <w:bCs/>
                 <w:noProof/>
@@ -3858,7 +5775,7 @@
               <w:spacing w:before="120" w:after="120"/>
               <w:jc w:val="center"/>
               <w:rPr>
-                <w:rFonts w:ascii="BelleAllureCE" w:hAnsi="BelleAllureCE" w:cstheme="minorHAnsi"/>
+                <w:rFonts w:ascii="Belle Allure CE" w:hAnsi="Belle Allure CE" w:cstheme="minorHAnsi"/>
                 <w:b/>
                 <w:bCs/>
                 <w:sz w:val="16"/>
@@ -3867,7 +5784,7 @@
             </w:pPr>
             <w:r>
               <w:rPr>
-                <w:rFonts w:ascii="BelleAllureCE" w:hAnsi="BelleAllureCE"/>
+                <w:rFonts w:ascii="Belle Allure CE" w:hAnsi="Belle Allure CE"/>
                 <w:b/>
                 <w:bCs/>
                 <w:noProof/>
@@ -3928,7 +5845,7 @@
               <w:spacing w:before="120" w:after="120"/>
               <w:jc w:val="center"/>
               <w:rPr>
-                <w:rFonts w:ascii="BelleAllureCE" w:hAnsi="BelleAllureCE" w:cstheme="minorHAnsi"/>
+                <w:rFonts w:ascii="Belle Allure CE" w:hAnsi="Belle Allure CE" w:cstheme="minorHAnsi"/>
                 <w:b/>
                 <w:bCs/>
                 <w:sz w:val="16"/>
@@ -3937,7 +5854,7 @@
             </w:pPr>
             <w:r>
               <w:rPr>
-                <w:rFonts w:ascii="BelleAllureCE" w:hAnsi="BelleAllureCE"/>
+                <w:rFonts w:ascii="Belle Allure CE" w:hAnsi="Belle Allure CE"/>
                 <w:b/>
                 <w:bCs/>
                 <w:noProof/>
@@ -4004,7 +5921,7 @@
               <w:spacing w:before="60"/>
               <w:jc w:val="center"/>
               <w:rPr>
-                <w:rFonts w:ascii="BelleAllureCE" w:hAnsi="BelleAllureCE" w:cstheme="minorHAnsi"/>
+                <w:rFonts w:ascii="Belle Allure CE" w:hAnsi="Belle Allure CE" w:cstheme="minorHAnsi"/>
                 <w:b/>
                 <w:bCs/>
                 <w:sz w:val="16"/>
@@ -4013,7 +5930,7 @@
             </w:pPr>
             <w:r>
               <w:rPr>
-                <w:rFonts w:ascii="BelleAllureCE" w:hAnsi="BelleAllureCE" w:cstheme="minorHAnsi"/>
+                <w:rFonts w:ascii="Belle Allure CE" w:hAnsi="Belle Allure CE" w:cstheme="minorHAnsi"/>
                 <w:b/>
                 <w:bCs/>
                 <w:sz w:val="16"/>
@@ -4023,7 +5940,7 @@
             </w:r>
             <w:r>
               <w:rPr>
-                <w:rFonts w:ascii="BelleAllureCE" w:hAnsi="BelleAllureCE" w:cstheme="minorHAnsi"/>
+                <w:rFonts w:ascii="Belle Allure CE" w:hAnsi="Belle Allure CE" w:cstheme="minorHAnsi"/>
                 <w:b/>
                 <w:bCs/>
                 <w:sz w:val="16"/>
@@ -4043,7 +5960,7 @@
               <w:spacing w:before="60"/>
               <w:jc w:val="center"/>
               <w:rPr>
-                <w:rFonts w:ascii="BelleAllureCE" w:hAnsi="BelleAllureCE" w:cstheme="minorHAnsi"/>
+                <w:rFonts w:ascii="Belle Allure CE" w:hAnsi="Belle Allure CE" w:cstheme="minorHAnsi"/>
                 <w:b/>
                 <w:bCs/>
                 <w:sz w:val="16"/>
@@ -4052,7 +5969,7 @@
             </w:pPr>
             <w:r>
               <w:rPr>
-                <w:rFonts w:ascii="BelleAllureCE" w:hAnsi="BelleAllureCE" w:cstheme="minorHAnsi"/>
+                <w:rFonts w:ascii="Belle Allure CE" w:hAnsi="Belle Allure CE" w:cstheme="minorHAnsi"/>
                 <w:b/>
                 <w:bCs/>
                 <w:sz w:val="16"/>
@@ -4072,7 +5989,7 @@
               <w:spacing w:before="60"/>
               <w:jc w:val="center"/>
               <w:rPr>
-                <w:rFonts w:ascii="BelleAllureCE" w:hAnsi="BelleAllureCE" w:cstheme="minorHAnsi"/>
+                <w:rFonts w:ascii="Belle Allure CE" w:hAnsi="Belle Allure CE" w:cstheme="minorHAnsi"/>
                 <w:b/>
                 <w:bCs/>
                 <w:sz w:val="16"/>
@@ -4081,7 +5998,7 @@
             </w:pPr>
             <w:r>
               <w:rPr>
-                <w:rFonts w:ascii="BelleAllureCE" w:hAnsi="BelleAllureCE" w:cstheme="minorHAnsi"/>
+                <w:rFonts w:ascii="Belle Allure CE" w:hAnsi="Belle Allure CE" w:cstheme="minorHAnsi"/>
                 <w:b/>
                 <w:bCs/>
                 <w:sz w:val="16"/>
@@ -4106,7 +6023,7 @@
               <w:spacing w:before="120" w:after="120"/>
               <w:jc w:val="center"/>
               <w:rPr>
-                <w:rFonts w:ascii="BelleAllureCE" w:hAnsi="BelleAllureCE"/>
+                <w:rFonts w:ascii="Belle Allure CE" w:hAnsi="Belle Allure CE"/>
                 <w:b/>
                 <w:bCs/>
                 <w:noProof/>
@@ -4116,7 +6033,7 @@
             </w:pPr>
             <w:r>
               <w:rPr>
-                <w:rFonts w:ascii="BelleAllureCE" w:hAnsi="BelleAllureCE"/>
+                <w:rFonts w:ascii="Belle Allure CE" w:hAnsi="Belle Allure CE"/>
                 <w:b/>
                 <w:bCs/>
                 <w:noProof/>
@@ -4177,7 +6094,7 @@
               <w:spacing w:before="120" w:after="120"/>
               <w:jc w:val="center"/>
               <w:rPr>
-                <w:rFonts w:ascii="BelleAllureCE" w:hAnsi="BelleAllureCE" w:cstheme="minorHAnsi"/>
+                <w:rFonts w:ascii="Belle Allure CE" w:hAnsi="Belle Allure CE" w:cstheme="minorHAnsi"/>
                 <w:b/>
                 <w:bCs/>
                 <w:sz w:val="16"/>
@@ -4186,7 +6103,7 @@
             </w:pPr>
             <w:r>
               <w:rPr>
-                <w:rFonts w:ascii="BelleAllureCE" w:hAnsi="BelleAllureCE"/>
+                <w:rFonts w:ascii="Belle Allure CE" w:hAnsi="Belle Allure CE"/>
                 <w:b/>
                 <w:bCs/>
                 <w:noProof/>
@@ -4247,7 +6164,7 @@
               <w:spacing w:before="120" w:after="120"/>
               <w:jc w:val="center"/>
               <w:rPr>
-                <w:rFonts w:ascii="BelleAllureCE" w:hAnsi="BelleAllureCE" w:cstheme="minorHAnsi"/>
+                <w:rFonts w:ascii="Belle Allure CE" w:hAnsi="Belle Allure CE" w:cstheme="minorHAnsi"/>
                 <w:b/>
                 <w:bCs/>
                 <w:sz w:val="16"/>
@@ -4256,7 +6173,7 @@
             </w:pPr>
             <w:r>
               <w:rPr>
-                <w:rFonts w:ascii="BelleAllureCE" w:hAnsi="BelleAllureCE"/>
+                <w:rFonts w:ascii="Belle Allure CE" w:hAnsi="Belle Allure CE"/>
                 <w:b/>
                 <w:bCs/>
                 <w:noProof/>
@@ -4316,7 +6233,7 @@
               <w:spacing w:before="60"/>
               <w:jc w:val="center"/>
               <w:rPr>
-                <w:rFonts w:ascii="BelleAllureCE" w:hAnsi="BelleAllureCE" w:cstheme="minorHAnsi"/>
+                <w:rFonts w:ascii="Belle Allure CE" w:hAnsi="Belle Allure CE" w:cstheme="minorHAnsi"/>
                 <w:b/>
                 <w:bCs/>
                 <w:sz w:val="16"/>
@@ -4325,7 +6242,7 @@
             </w:pPr>
             <w:r>
               <w:rPr>
-                <w:rFonts w:ascii="BelleAllureCE" w:hAnsi="BelleAllureCE" w:cstheme="minorHAnsi"/>
+                <w:rFonts w:ascii="Belle Allure CE" w:hAnsi="Belle Allure CE" w:cstheme="minorHAnsi"/>
                 <w:b/>
                 <w:bCs/>
                 <w:sz w:val="16"/>
@@ -4345,7 +6262,7 @@
               <w:spacing w:before="60"/>
               <w:jc w:val="center"/>
               <w:rPr>
-                <w:rFonts w:ascii="BelleAllureCE" w:hAnsi="BelleAllureCE" w:cstheme="minorHAnsi"/>
+                <w:rFonts w:ascii="Belle Allure CE" w:hAnsi="Belle Allure CE" w:cstheme="minorHAnsi"/>
                 <w:b/>
                 <w:bCs/>
                 <w:sz w:val="16"/>
@@ -4354,7 +6271,7 @@
             </w:pPr>
             <w:r>
               <w:rPr>
-                <w:rFonts w:ascii="BelleAllureCE" w:hAnsi="BelleAllureCE" w:cstheme="minorHAnsi"/>
+                <w:rFonts w:ascii="Belle Allure CE" w:hAnsi="Belle Allure CE" w:cstheme="minorHAnsi"/>
                 <w:b/>
                 <w:bCs/>
                 <w:sz w:val="16"/>
@@ -4374,7 +6291,7 @@
               <w:spacing w:before="60"/>
               <w:jc w:val="center"/>
               <w:rPr>
-                <w:rFonts w:ascii="BelleAllureCE" w:hAnsi="BelleAllureCE" w:cstheme="minorHAnsi"/>
+                <w:rFonts w:ascii="Belle Allure CE" w:hAnsi="Belle Allure CE" w:cstheme="minorHAnsi"/>
                 <w:b/>
                 <w:bCs/>
                 <w:sz w:val="16"/>
@@ -4383,7 +6300,7 @@
             </w:pPr>
             <w:r>
               <w:rPr>
-                <w:rFonts w:ascii="BelleAllureCE" w:hAnsi="BelleAllureCE" w:cstheme="minorHAnsi"/>
+                <w:rFonts w:ascii="Belle Allure CE" w:hAnsi="Belle Allure CE" w:cstheme="minorHAnsi"/>
                 <w:b/>
                 <w:bCs/>
                 <w:sz w:val="16"/>
@@ -4408,7 +6325,7 @@
               <w:spacing w:before="120" w:after="120"/>
               <w:jc w:val="center"/>
               <w:rPr>
-                <w:rFonts w:ascii="BelleAllureCE" w:hAnsi="BelleAllureCE"/>
+                <w:rFonts w:ascii="Belle Allure CE" w:hAnsi="Belle Allure CE"/>
                 <w:b/>
                 <w:bCs/>
                 <w:noProof/>
@@ -4418,7 +6335,7 @@
             </w:pPr>
             <w:r>
               <w:rPr>
-                <w:rFonts w:ascii="BelleAllureCE" w:hAnsi="BelleAllureCE"/>
+                <w:rFonts w:ascii="Belle Allure CE" w:hAnsi="Belle Allure CE"/>
                 <w:b/>
                 <w:bCs/>
                 <w:noProof/>
@@ -4473,7 +6390,7 @@
               <w:spacing w:before="120" w:after="120"/>
               <w:jc w:val="center"/>
               <w:rPr>
-                <w:rFonts w:ascii="BelleAllureCE" w:hAnsi="BelleAllureCE"/>
+                <w:rFonts w:ascii="Belle Allure CE" w:hAnsi="Belle Allure CE"/>
                 <w:b/>
                 <w:bCs/>
                 <w:noProof/>
@@ -4483,7 +6400,7 @@
             </w:pPr>
             <w:r>
               <w:rPr>
-                <w:rFonts w:ascii="BelleAllureCE" w:hAnsi="BelleAllureCE"/>
+                <w:rFonts w:ascii="Belle Allure CE" w:hAnsi="Belle Allure CE"/>
                 <w:b/>
                 <w:bCs/>
                 <w:noProof/>
@@ -4545,7 +6462,7 @@
               <w:spacing w:before="120" w:after="120"/>
               <w:jc w:val="center"/>
               <w:rPr>
-                <w:rFonts w:ascii="BelleAllureCE" w:hAnsi="BelleAllureCE"/>
+                <w:rFonts w:ascii="Belle Allure CE" w:hAnsi="Belle Allure CE"/>
                 <w:b/>
                 <w:bCs/>
                 <w:noProof/>
@@ -4555,7 +6472,7 @@
             </w:pPr>
             <w:r>
               <w:rPr>
-                <w:rFonts w:ascii="BelleAllureCE" w:hAnsi="BelleAllureCE"/>
+                <w:rFonts w:ascii="Belle Allure CE" w:hAnsi="Belle Allure CE"/>
                 <w:b/>
                 <w:bCs/>
                 <w:noProof/>

</xml_diff>